<commit_message>
Bible docx: title 23pt, body text 18pt (restore prior sizing)
Co-Authored-By: Claude Sonnet 5 <noreply@anthropic.com>
Claude-Session: https://claude.ai/code/session_01Wu3hztwmLhvQB1sr3dL5GZ
</commit_message>
<xml_diff>
--- a/runs/F2_08052026/F2_TOP_STORIES_08052026_BIBLE.docx
+++ b/runs/F2_08052026/F2_TOP_STORIES_08052026_BIBLE.docx
@@ -10,8 +10,8 @@
         <w:rPr>
           <w:b/>
           <w:bCs/>
-          <w:sz w:val="30"/>
-          <w:szCs w:val="30"/>
+          <w:sz w:val="46"/>
+          <w:szCs w:val="46"/>
         </w:rPr>
         <w:t xml:space="preserve">F2 TOP STORIES — WEDNESDAY, AUGUST 5</w:t>
       </w:r>
@@ -25,8 +25,8 @@
           <w:i/>
           <w:iCs/>
           <w:color w:val="555555"/>
-          <w:sz w:val="18"/>
-          <w:szCs w:val="18"/>
+          <w:sz w:val="36"/>
+          <w:szCs w:val="36"/>
         </w:rPr>
         <w:t xml:space="preserve">Bible with clips embedded. Blue = clip to pull (IN/OUT + verbatim outcue). Red = weak fit or case-swap. Clips are located and timecoded for a human to pull and cut — nothing was auto-downloaded.</w:t>
       </w:r>
@@ -39,6 +39,8 @@
         <w:rPr>
           <w:b/>
           <w:bCs/>
+          <w:sz w:val="36"/>
+          <w:szCs w:val="36"/>
         </w:rPr>
         <w:t xml:space="preserve">F2 TOP STORIES — WEDNESDAY, AUGUST 5</w:t>
       </w:r>
@@ -52,6 +54,8 @@
         <w:rPr>
           <w:b/>
           <w:bCs/>
+          <w:sz w:val="36"/>
+          <w:szCs w:val="36"/>
         </w:rPr>
         <w:t xml:space="preserve">AMAZON OWES YOU MONEY RIGHT NOW</w:t>
       </w:r>
@@ -65,6 +69,8 @@
         <w:rPr>
           <w:b w:val="false"/>
           <w:bCs w:val="false"/>
+          <w:sz w:val="36"/>
+          <w:szCs w:val="36"/>
         </w:rPr>
         <w:t xml:space="preserve">-AMAZON IS SITTING ON MONEY THAT BELONGS TO YOU… AND THEY ARE NEVER GOING TO CALL YOU ABOUT IT.</w:t>
       </w:r>
@@ -78,6 +84,8 @@
         <w:rPr>
           <w:b w:val="false"/>
           <w:bCs w:val="false"/>
+          <w:sz w:val="36"/>
+          <w:szCs w:val="36"/>
         </w:rPr>
         <w:t xml:space="preserve">-IF A PACKAGE SHOWED UP LATE, AMAZON’S OWN GUARANTEED DELIVERY POLICY MAY OWE YOU A REFUND.</w:t>
       </w:r>
@@ -91,6 +99,8 @@
         <w:rPr>
           <w:b w:val="false"/>
           <w:bCs w:val="false"/>
+          <w:sz w:val="36"/>
+          <w:szCs w:val="36"/>
         </w:rPr>
         <w:t xml:space="preserve">-IF A PACKAGE SAID DELIVERED AND NEVER SHOWED UP… THE A-TO-Z GUARANTEE IS SUPPOSED TO COVER YOU.</w:t>
       </w:r>
@@ -104,6 +114,8 @@
         <w:rPr>
           <w:b w:val="false"/>
           <w:bCs w:val="false"/>
+          <w:sz w:val="36"/>
+          <w:szCs w:val="36"/>
         </w:rPr>
         <w:t xml:space="preserve">-AND 35 MILLION PEOPLE COULD BE ELIGIBLE FOR A CHECK UP TO $51 FROM THE F-T-C’S $2.5 BILLION SETTLEMENT WITH AMAZON.</w:t>
       </w:r>
@@ -117,6 +129,8 @@
         <w:rPr>
           <w:b w:val="false"/>
           <w:bCs w:val="false"/>
+          <w:sz w:val="36"/>
+          <w:szCs w:val="36"/>
         </w:rPr>
         <w:t xml:space="preserve">-THOSE PAYMENTS ARE LANDING BY SEPTEMBER… WE’LL SHOW YOU HOW TO KNOW IF YOURS IS COMING.</w:t>
       </w:r>
@@ -130,6 +144,8 @@
         <w:rPr>
           <w:b w:val="false"/>
           <w:bCs w:val="false"/>
+          <w:sz w:val="36"/>
+          <w:szCs w:val="36"/>
         </w:rPr>
         <w:t xml:space="preserve">-WE’RE GOING THROUGH EVERY BUTTON YOU CLICK TO GET YOUR MONEY BACK.</w:t>
       </w:r>
@@ -143,6 +159,8 @@
         <w:rPr>
           <w:b w:val="false"/>
           <w:bCs w:val="false"/>
+          <w:sz w:val="36"/>
+          <w:szCs w:val="36"/>
         </w:rPr>
         <w:t xml:space="preserve">—------------------------------------------------</w:t>
       </w:r>
@@ -156,6 +174,8 @@
         <w:rPr>
           <w:b/>
           <w:bCs/>
+          <w:sz w:val="36"/>
+          <w:szCs w:val="36"/>
         </w:rPr>
         <w:t xml:space="preserve">DANGEROUS RECALLED PRODUCTS ARE SITTING IN YOUR HOUSE</w:t>
       </w:r>
@@ -169,6 +189,8 @@
         <w:rPr>
           <w:b w:val="false"/>
           <w:bCs w:val="false"/>
+          <w:sz w:val="36"/>
+          <w:szCs w:val="36"/>
         </w:rPr>
         <w:t xml:space="preserve">-THERE IS A PAGE INSIDE YOUR AMAZON ACCOUNT THAT LISTS RECALLED PRODUCTS YOU ACTUALLY BOUGHT.</w:t>
       </w:r>
@@ -182,6 +204,8 @@
         <w:rPr>
           <w:b w:val="false"/>
           <w:bCs w:val="false"/>
+          <w:sz w:val="36"/>
+          <w:szCs w:val="36"/>
         </w:rPr>
         <w:t xml:space="preserve">-ALMOST NOBODY KNOWS IT EXISTS… WE’LL SHOW YOU HOW TO FIND IT IN TEN SECONDS.</w:t>
       </w:r>
@@ -195,6 +219,8 @@
         <w:rPr>
           <w:b w:val="false"/>
           <w:bCs w:val="false"/>
+          <w:sz w:val="36"/>
+          <w:szCs w:val="36"/>
         </w:rPr>
         <w:t xml:space="preserve">-FEDERAL REGULATORS SAY AMAZON FAILED TO NOTIFY THE PUBLIC ABOUT MORE THAN 400,000 HAZARDOUS PRODUCTS.</w:t>
       </w:r>
@@ -208,6 +234,8 @@
         <w:rPr>
           <w:b w:val="false"/>
           <w:bCs w:val="false"/>
+          <w:sz w:val="36"/>
+          <w:szCs w:val="36"/>
         </w:rPr>
         <w:t xml:space="preserve">-AND THIS MONTH, ANOTHER RECALLED PRODUCT SOLD ALL OVER AMAZON WAS CATCHING FIRE — LITHIUM POWER BANKS.</w:t>
       </w:r>
@@ -221,6 +249,8 @@
         <w:rPr>
           <w:b w:val="false"/>
           <w:bCs w:val="false"/>
+          <w:sz w:val="36"/>
+          <w:szCs w:val="36"/>
         </w:rPr>
         <w:t xml:space="preserve">-DOZENS OF FIRES AND EXPLOSIONS. HUNDREDS OF THOUSANDS OF UNITS. AND THEY WERE STILL FOR SALE ON AMAZON.</w:t>
       </w:r>
@@ -234,6 +264,8 @@
         <w:rPr>
           <w:b w:val="false"/>
           <w:bCs w:val="false"/>
+          <w:sz w:val="36"/>
+          <w:szCs w:val="36"/>
         </w:rPr>
         <w:t xml:space="preserve">—------------------------------------------------</w:t>
       </w:r>
@@ -247,6 +279,8 @@
         <w:rPr>
           <w:b/>
           <w:bCs/>
+          <w:sz w:val="36"/>
+          <w:szCs w:val="36"/>
         </w:rPr>
         <w:t xml:space="preserve">THE FAKE RECALL TEXT THAT DRAINS YOUR BANK ACCOUNT</w:t>
       </w:r>
@@ -260,6 +294,8 @@
         <w:rPr>
           <w:b w:val="false"/>
           <w:bCs w:val="false"/>
+          <w:sz w:val="36"/>
+          <w:szCs w:val="36"/>
         </w:rPr>
         <w:t xml:space="preserve">-SCAMMERS READ THE SAME HEADLINES YOU DO.</w:t>
       </w:r>
@@ -273,6 +309,8 @@
         <w:rPr>
           <w:b w:val="false"/>
           <w:bCs w:val="false"/>
+          <w:sz w:val="36"/>
+          <w:szCs w:val="36"/>
         </w:rPr>
         <w:t xml:space="preserve">-NOW THEY’RE TEXTING YOU CLAIMING AN ITEM YOU BOUGHT ON AMAZON HAS BEEN RECALLED.</w:t>
       </w:r>
@@ -286,6 +324,8 @@
         <w:rPr>
           <w:b w:val="false"/>
           <w:bCs w:val="false"/>
+          <w:sz w:val="36"/>
+          <w:szCs w:val="36"/>
         </w:rPr>
         <w:t xml:space="preserve">-THEY OFFER A FULL REFUND… AND SAY YOU DON’T EVEN HAVE TO SEND THE ITEM BACK.</w:t>
       </w:r>
@@ -299,6 +339,8 @@
         <w:rPr>
           <w:b w:val="false"/>
           <w:bCs w:val="false"/>
+          <w:sz w:val="36"/>
+          <w:szCs w:val="36"/>
         </w:rPr>
         <w:t xml:space="preserve">-THE F-T-C SAYS IT’S A PHISHING TRAP BUILT TO EMPTY YOUR ACCOUNT.</w:t>
       </w:r>
@@ -312,6 +354,8 @@
         <w:rPr>
           <w:b w:val="false"/>
           <w:bCs w:val="false"/>
+          <w:sz w:val="36"/>
+          <w:szCs w:val="36"/>
         </w:rPr>
         <w:t xml:space="preserve">-WE’LL SHOW YOU THE ONE DETAIL THAT GIVES IT AWAY EVERY SINGLE TIME.</w:t>
       </w:r>
@@ -325,6 +369,8 @@
         <w:rPr>
           <w:b w:val="false"/>
           <w:bCs w:val="false"/>
+          <w:sz w:val="36"/>
+          <w:szCs w:val="36"/>
         </w:rPr>
         <w:t xml:space="preserve">—------------------------------------------------</w:t>
       </w:r>
@@ -338,6 +384,8 @@
         <w:rPr>
           <w:b/>
           <w:bCs/>
+          <w:sz w:val="36"/>
+          <w:szCs w:val="36"/>
         </w:rPr>
         <w:t xml:space="preserve">TAX FREE WEEKEND IS HERE</w:t>
       </w:r>
@@ -351,6 +399,8 @@
         <w:rPr>
           <w:b w:val="false"/>
           <w:bCs w:val="false"/>
+          <w:sz w:val="36"/>
+          <w:szCs w:val="36"/>
         </w:rPr>
         <w:t xml:space="preserve">-THEN, GOOD NEWS!!</w:t>
       </w:r>
@@ -364,6 +414,8 @@
         <w:rPr>
           <w:b w:val="false"/>
           <w:bCs w:val="false"/>
+          <w:sz w:val="36"/>
+          <w:szCs w:val="36"/>
         </w:rPr>
         <w:t xml:space="preserve">-THIS WEEKEND, SIX STATES SHUT OFF SALES TAX COMPLETELY.</w:t>
       </w:r>
@@ -377,6 +429,8 @@
         <w:rPr>
           <w:b w:val="false"/>
           <w:bCs w:val="false"/>
+          <w:sz w:val="36"/>
+          <w:szCs w:val="36"/>
         </w:rPr>
         <w:t xml:space="preserve">-TEXAS, OHIO, MISSOURI, VIRGINIA, SOUTH CAROLINA AND OKLAHOMA… AUGUST 7TH THROUGH THE 9TH.</w:t>
       </w:r>
@@ -390,6 +444,8 @@
         <w:rPr>
           <w:b w:val="false"/>
           <w:bCs w:val="false"/>
+          <w:sz w:val="36"/>
+          <w:szCs w:val="36"/>
         </w:rPr>
         <w:t xml:space="preserve">-CLOTHES, SHOES, BACKPACKS, SCHOOL SUPPLIES… AND IN SOME STATES, COMPUTERS.</w:t>
       </w:r>
@@ -403,6 +459,8 @@
         <w:rPr>
           <w:b w:val="false"/>
           <w:bCs w:val="false"/>
+          <w:sz w:val="36"/>
+          <w:szCs w:val="36"/>
         </w:rPr>
         <w:t xml:space="preserve">-WE’LL SHOW YOU THE PRICE LIMITS, THE TRAPS, AND HOW TO STACK IT ON TOP OF A SALE.</w:t>
       </w:r>
@@ -417,6 +475,8 @@
         <w:rPr>
           <w:b/>
           <w:bCs/>
+          <w:sz w:val="36"/>
+          <w:szCs w:val="36"/>
         </w:rPr>
         <w:t xml:space="preserve">HIT LIKE AND SUBSCRIBE</w:t>
       </w:r>
@@ -430,6 +490,8 @@
         <w:rPr>
           <w:b/>
           <w:bCs/>
+          <w:sz w:val="36"/>
+          <w:szCs w:val="36"/>
         </w:rPr>
         <w:t xml:space="preserve">JOIN THE CHAT</w:t>
       </w:r>
@@ -444,6 +506,8 @@
         <w:rPr>
           <w:b/>
           <w:bCs/>
+          <w:sz w:val="36"/>
+          <w:szCs w:val="36"/>
         </w:rPr>
         <w:t xml:space="preserve">AMAZON OWES YOU MONEY — HERE’S HOW TO TAKE IT BACK</w:t>
       </w:r>
@@ -457,6 +521,8 @@
         <w:rPr>
           <w:b w:val="false"/>
           <w:bCs w:val="false"/>
+          <w:sz w:val="36"/>
+          <w:szCs w:val="36"/>
         </w:rPr>
         <w:t xml:space="preserve">-AMAZON HAS POLICIES THAT PUT REAL MONEY BACK IN YOUR POCKET.</w:t>
       </w:r>
@@ -470,6 +536,8 @@
         <w:rPr>
           <w:b w:val="false"/>
           <w:bCs w:val="false"/>
+          <w:sz w:val="36"/>
+          <w:szCs w:val="36"/>
         </w:rPr>
         <w:t xml:space="preserve">-THEY ARE NOT A LOOPHOLE. THEY ARE NOT A TRICK. THEY ARE WRITTEN ON AMAZON’S OWN WEBSITE.</w:t>
       </w:r>
@@ -483,6 +551,8 @@
         <w:rPr>
           <w:b w:val="false"/>
           <w:bCs w:val="false"/>
+          <w:sz w:val="36"/>
+          <w:szCs w:val="36"/>
         </w:rPr>
         <w:t xml:space="preserve">-BUT THEY ONLY PAY OUT IF YOU ASK.</w:t>
       </w:r>
@@ -496,6 +566,8 @@
         <w:rPr>
           <w:b w:val="false"/>
           <w:bCs w:val="false"/>
+          <w:sz w:val="36"/>
+          <w:szCs w:val="36"/>
         </w:rPr>
         <w:t xml:space="preserve">-NOBODY AT AMAZON IS GOING TO CALL YOU AND SAY, HEY, WE OWE YOU TWELVE BUCKS.</w:t>
       </w:r>
@@ -509,6 +581,8 @@
         <w:rPr>
           <w:b w:val="false"/>
           <w:bCs w:val="false"/>
+          <w:sz w:val="36"/>
+          <w:szCs w:val="36"/>
         </w:rPr>
         <w:t xml:space="preserve">-I DO THIS ON MY OWN ACCOUNT… IT TAKES ABOUT 90 SECONDS.</w:t>
       </w:r>
@@ -522,6 +596,8 @@
         <w:rPr>
           <w:b w:val="false"/>
           <w:bCs w:val="false"/>
+          <w:sz w:val="36"/>
+          <w:szCs w:val="36"/>
         </w:rPr>
         <w:t xml:space="preserve">-LET’S START WITH THE ONE ALMOST NOBODY EVER CLAIMS.</w:t>
       </w:r>
@@ -535,6 +611,8 @@
         <w:rPr>
           <w:b/>
           <w:bCs/>
+          <w:sz w:val="36"/>
+          <w:szCs w:val="36"/>
         </w:rPr>
         <w:t xml:space="preserve">THE GUARANTEED DELIVERY REFUND</w:t>
       </w:r>
@@ -548,6 +626,8 @@
         <w:rPr>
           <w:b w:val="false"/>
           <w:bCs w:val="false"/>
+          <w:sz w:val="36"/>
+          <w:szCs w:val="36"/>
         </w:rPr>
         <w:t xml:space="preserve">-WHEN YOU CHECK OUT, SOMETIMES AMAZON SHOWS YOU A GUARANTEED DELIVERY DATE.</w:t>
       </w:r>
@@ -561,6 +641,8 @@
         <w:rPr>
           <w:b w:val="false"/>
           <w:bCs w:val="false"/>
+          <w:sz w:val="36"/>
+          <w:szCs w:val="36"/>
         </w:rPr>
         <w:t xml:space="preserve">-THAT IS COMPLETELY DIFFERENT FROM AN ESTIMATED DELIVERY DATE… AND THE DIFFERENCE IS WORTH MONEY.</w:t>
       </w:r>
@@ -574,6 +656,8 @@
         <w:rPr>
           <w:b w:val="false"/>
           <w:bCs w:val="false"/>
+          <w:sz w:val="36"/>
+          <w:szCs w:val="36"/>
         </w:rPr>
         <w:t xml:space="preserve">-A GUARANTEE IS A PROMISE. AN ESTIMATE IS A GUESS.</w:t>
       </w:r>
@@ -587,6 +671,8 @@
         <w:rPr>
           <w:b w:val="false"/>
           <w:bCs w:val="false"/>
+          <w:sz w:val="36"/>
+          <w:szCs w:val="36"/>
         </w:rPr>
         <w:t xml:space="preserve">-REMEMBER THAT.</w:t>
       </w:r>
@@ -600,6 +686,8 @@
         <w:rPr>
           <w:b w:val="false"/>
           <w:bCs w:val="false"/>
+          <w:sz w:val="36"/>
+          <w:szCs w:val="36"/>
         </w:rPr>
         <w:t xml:space="preserve">-AMAZON’S OWN GUARANTEED DELIVERY TERMS SAY IF THEY MISS THAT DATE, YOUR SHIPPING FEES MAY BE REFUNDED.</w:t>
       </w:r>
@@ -613,6 +701,8 @@
         <w:rPr>
           <w:b w:val="false"/>
           <w:bCs w:val="false"/>
+          <w:sz w:val="36"/>
+          <w:szCs w:val="36"/>
         </w:rPr>
         <w:t xml:space="preserve">-THERE ARE CONDITIONS. YOU HAVE TO PICK THE SHIPPING OPTION ADVERTISED ON THE PRODUCT PAGE.</w:t>
       </w:r>
@@ -626,6 +716,8 @@
         <w:rPr>
           <w:b w:val="false"/>
           <w:bCs w:val="false"/>
+          <w:sz w:val="36"/>
+          <w:szCs w:val="36"/>
         </w:rPr>
         <w:t xml:space="preserve">-YOU HAVE TO ORDER BEFORE THAT ORDER WITHIN COUNTDOWN CLOCK RUNS OUT AT CHECKOUT.</w:t>
       </w:r>
@@ -639,6 +731,8 @@
         <w:rPr>
           <w:b w:val="false"/>
           <w:bCs w:val="false"/>
+          <w:sz w:val="36"/>
+          <w:szCs w:val="36"/>
         </w:rPr>
         <w:t xml:space="preserve">-AND YOUR CONFIRMED DELIVERY DATE IS SITTING RIGHT THERE IN YOUR ORDER CONFIRMATION EMAIL.</w:t>
       </w:r>
@@ -652,6 +746,8 @@
         <w:rPr>
           <w:b w:val="false"/>
           <w:bCs w:val="false"/>
+          <w:sz w:val="36"/>
+          <w:szCs w:val="36"/>
         </w:rPr>
         <w:t xml:space="preserve">-SO GO FIND THAT EMAIL. THAT EMAIL IS YOUR RECEIPT.</w:t>
       </w:r>
@@ -665,6 +761,8 @@
         <w:rPr>
           <w:b w:val="false"/>
           <w:bCs w:val="false"/>
+          <w:sz w:val="36"/>
+          <w:szCs w:val="36"/>
         </w:rPr>
         <w:t xml:space="preserve">-HERE IS THE EXACT PATH AMAZON PUBLISHES… GO TO YOUR ORDERS… SELECT THE LATE ORDER…</w:t>
       </w:r>
@@ -678,6 +776,8 @@
         <w:rPr>
           <w:b w:val="false"/>
           <w:bCs w:val="false"/>
+          <w:sz w:val="36"/>
+          <w:szCs w:val="36"/>
         </w:rPr>
         <w:t xml:space="preserve">-CLICK PROBLEM WITH AN ORDER… THEN SHIPPING OR DELIVERY ISSUES… THEN SHIPMENT IS LATE.</w:t>
       </w:r>
@@ -691,6 +791,8 @@
         <w:rPr>
           <w:b w:val="false"/>
           <w:bCs w:val="false"/>
+          <w:sz w:val="36"/>
+          <w:szCs w:val="36"/>
         </w:rPr>
         <w:t xml:space="preserve">-THAT’S IT. THAT IS THE WHOLE THING.</w:t>
       </w:r>
@@ -704,6 +806,8 @@
         <w:rPr>
           <w:b w:val="false"/>
           <w:bCs w:val="false"/>
+          <w:sz w:val="36"/>
+          <w:szCs w:val="36"/>
         </w:rPr>
         <w:t xml:space="preserve">-AND IF YOU’RE A PRIME MEMBER WHO NEVER PAID A SHIPPING FEE, THERE’S NOTHING TO REFUND…</w:t>
       </w:r>
@@ -717,6 +821,8 @@
         <w:rPr>
           <w:b w:val="false"/>
           <w:bCs w:val="false"/>
+          <w:sz w:val="36"/>
+          <w:szCs w:val="36"/>
         </w:rPr>
         <w:t xml:space="preserve">-SO ASK THE AGENT DIRECTLY FOR AN ACCOUNT CREDIT INSTEAD. YOU HAVE TO SAY THE WORDS.</w:t>
       </w:r>
@@ -730,6 +836,8 @@
         <w:rPr>
           <w:b w:val="false"/>
           <w:bCs w:val="false"/>
+          <w:sz w:val="36"/>
+          <w:szCs w:val="36"/>
         </w:rPr>
         <w:t xml:space="preserve">-WATCH HIM SHOW YOU HOW.</w:t>
       </w:r>
@@ -744,6 +852,8 @@
           <w:b/>
           <w:bCs/>
           <w:color w:val="C0392B"/>
+          <w:sz w:val="36"/>
+          <w:szCs w:val="36"/>
         </w:rPr>
         <w:t xml:space="preserve">▶ CLIP (WEAK — RE-CHECK) — explainer_demo/creator_long  /  HORIZONTAL</w:t>
       </w:r>
@@ -755,13 +865,17 @@
       <w:r>
         <w:rPr>
           <w:color w:val="1155CC"/>
+          <w:sz w:val="36"/>
+          <w:szCs w:val="36"/>
         </w:rPr>
         <w:t xml:space="preserve">Source: In the Black (creator_long, youtube)  —  </w:t>
       </w:r>
-      <w:hyperlink w:history="1" r:id="rIdqnp9m5lqcryy3xbcejwo1">
+      <w:hyperlink w:history="1" r:id="rIdgm7jwwqyxfaezzfkke-l1">
         <w:r>
           <w:rPr>
             <w:color w:val="1155CC"/>
+            <w:sz w:val="36"/>
+            <w:szCs w:val="36"/>
             <w:u w:val="single"/>
           </w:rPr>
           <w:t xml:space="preserve">https://www.youtube.com/watch?v=_8W0-cK5XTQ</w:t>
@@ -777,6 +891,8 @@
           <w:b/>
           <w:bCs/>
           <w:color w:val="1155CC"/>
+          <w:sz w:val="36"/>
+          <w:szCs w:val="36"/>
         </w:rPr>
         <w:t xml:space="preserve">IN 1:02  OUT 1:41  outcue: “worth a shot though”</w:t>
       </w:r>
@@ -790,6 +906,8 @@
           <w:b/>
           <w:bCs/>
           <w:color w:val="1155CC"/>
+          <w:sz w:val="36"/>
+          <w:szCs w:val="36"/>
         </w:rPr>
         <w:t xml:space="preserve">IN 2:34  OUT 3:53  outcue: “10 credit easy”</w:t>
       </w:r>
@@ -803,6 +921,8 @@
           <w:i/>
           <w:iCs/>
           <w:color w:val="1155CC"/>
+          <w:sz w:val="36"/>
+          <w:szCs w:val="36"/>
         </w:rPr>
         <w:t xml:space="preserve">“DO THIS every time an Amazon package arrives late”</w:t>
       </w:r>
@@ -816,6 +936,8 @@
           <w:i/>
           <w:iCs/>
           <w:color w:val="C0392B"/>
+          <w:sz w:val="36"/>
+          <w:szCs w:val="36"/>
         </w:rPr>
         <w:t xml:space="preserve">⚠ WEAK FIT: fit is the general late-delivery credit, not specifically the guaranteed-delivery shipping-fee refund. Producer should confirm or treat as show-produced.</w:t>
       </w:r>
@@ -834,6 +956,8 @@
         <w:rPr>
           <w:b w:val="false"/>
           <w:bCs w:val="false"/>
+          <w:sz w:val="36"/>
+          <w:szCs w:val="36"/>
         </w:rPr>
         <w:t xml:space="preserve">(((CREATE FULL SCREEN GRAPHIC XXX)))</w:t>
       </w:r>
@@ -847,6 +971,8 @@
         <w:rPr>
           <w:b/>
           <w:bCs/>
+          <w:sz w:val="36"/>
+          <w:szCs w:val="36"/>
         </w:rPr>
         <w:t xml:space="preserve">LATE PACKAGE? CLICK THIS:</w:t>
       </w:r>
@@ -859,6 +985,8 @@
         <w:rPr>
           <w:b/>
           <w:bCs/>
+          <w:sz w:val="36"/>
+          <w:szCs w:val="36"/>
         </w:rPr>
         <w:t xml:space="preserve">YOUR ORDERS</w:t>
       </w:r>
@@ -871,6 +999,8 @@
         <w:rPr>
           <w:b/>
           <w:bCs/>
+          <w:sz w:val="36"/>
+          <w:szCs w:val="36"/>
         </w:rPr>
         <w:t xml:space="preserve">PROBLEM WITH AN ORDER</w:t>
       </w:r>
@@ -883,6 +1013,8 @@
         <w:rPr>
           <w:b/>
           <w:bCs/>
+          <w:sz w:val="36"/>
+          <w:szCs w:val="36"/>
         </w:rPr>
         <w:t xml:space="preserve">SHIPPING OR DELIVERY ISSUES</w:t>
       </w:r>
@@ -895,6 +1027,8 @@
         <w:rPr>
           <w:b/>
           <w:bCs/>
+          <w:sz w:val="36"/>
+          <w:szCs w:val="36"/>
         </w:rPr>
         <w:t xml:space="preserve">SHIPMENT IS LATE</w:t>
       </w:r>
@@ -908,6 +1042,8 @@
         <w:rPr>
           <w:b/>
           <w:bCs/>
+          <w:sz w:val="36"/>
+          <w:szCs w:val="36"/>
         </w:rPr>
         <w:t xml:space="preserve">PACKAGES THAT SAY DELIVERED — BUT NEVER SHOW UP  </w:t>
       </w:r>
@@ -916,8 +1052,8 @@
           <w:i/>
           <w:iCs/>
           <w:color w:val="C0392B"/>
-          <w:sz w:val="16"/>
-          <w:szCs w:val="16"/>
+          <w:sz w:val="36"/>
+          <w:szCs w:val="36"/>
         </w:rPr>
         <w:t xml:space="preserve">[[SWAP: was vertical doorbell-cam evidence]]</w:t>
       </w:r>
@@ -931,6 +1067,8 @@
         <w:rPr>
           <w:b w:val="false"/>
           <w:bCs w:val="false"/>
+          <w:sz w:val="36"/>
+          <w:szCs w:val="36"/>
         </w:rPr>
         <w:t xml:space="preserve">-YOUR PHONE BUZZES. DELIVERED. THERE'S EVEN A PHOTO OF YOUR FRONT DOOR. YOU GO OUTSIDE… AND THERE IS NOTHING THERE.</w:t>
       </w:r>
@@ -943,6 +1081,8 @@
         <w:rPr>
           <w:b w:val="false"/>
           <w:bCs w:val="false"/>
+          <w:sz w:val="36"/>
+          <w:szCs w:val="36"/>
         </w:rPr>
         <w:t xml:space="preserve">-AMAZON TELLS YOU TO WAIT 24 TO 48 HOURS, BECAUSE SOMETIMES THE SCAN RUNS AHEAD OF THE TRUCK.</w:t>
       </w:r>
@@ -955,6 +1095,8 @@
         <w:rPr>
           <w:b w:val="false"/>
           <w:bCs w:val="false"/>
+          <w:sz w:val="36"/>
+          <w:szCs w:val="36"/>
         </w:rPr>
         <w:t xml:space="preserve">-FINE. WAIT. BUT AFTER THAT, YOU ARE NOT BEGGING FOR A FAVOR. YOU ARE OWED.</w:t>
       </w:r>
@@ -967,6 +1109,8 @@
         <w:rPr>
           <w:b w:val="false"/>
           <w:bCs w:val="false"/>
+          <w:sz w:val="36"/>
+          <w:szCs w:val="36"/>
         </w:rPr>
         <w:t xml:space="preserve">-AND IT IS NOT ALWAYS AMAZON ITSELF. INVESTIGATORS ARE DIGGING INTO SHIPPERS WHOSE TRACKING SAYS DELIVERED WHEN IT ISN'T.</w:t>
       </w:r>
@@ -979,6 +1123,8 @@
         <w:rPr>
           <w:b w:val="false"/>
           <w:bCs w:val="false"/>
+          <w:sz w:val="36"/>
+          <w:szCs w:val="36"/>
         </w:rPr>
         <w:t xml:space="preserve">-LISTEN TO THESE SHOPPERS WHO PAID, WATCHED THE TRACKING MOVE, AND NEVER GOT THEIR PACKAGES.</w:t>
       </w:r>
@@ -992,6 +1138,8 @@
           <w:b/>
           <w:bCs/>
           <w:color w:val="C0392B"/>
+          <w:sz w:val="36"/>
+          <w:szCs w:val="36"/>
         </w:rPr>
         <w:t xml:space="preserve">▶ CLIP (CASE-SWAP) — victim_interview  /  HORIZONTAL</w:t>
       </w:r>
@@ -1003,13 +1151,17 @@
       <w:r>
         <w:rPr>
           <w:color w:val="1155CC"/>
+          <w:sz w:val="36"/>
+          <w:szCs w:val="36"/>
         </w:rPr>
         <w:t xml:space="preserve">Source: KXAN (affiliate, youtube)  —  </w:t>
       </w:r>
-      <w:hyperlink w:history="1" r:id="rIdfgh8q4jmfx8gdmbtedvsx">
+      <w:hyperlink w:history="1" r:id="rIdgqdisnjcyfmcl2xvj9yek">
         <w:r>
           <w:rPr>
             <w:color w:val="1155CC"/>
+            <w:sz w:val="36"/>
+            <w:szCs w:val="36"/>
             <w:u w:val="single"/>
           </w:rPr>
           <w:t xml:space="preserve">https://www.youtube.com/watch?v=yEfQr9uDnH8</w:t>
@@ -1025,6 +1177,8 @@
           <w:b/>
           <w:bCs/>
           <w:color w:val="1155CC"/>
+          <w:sz w:val="36"/>
+          <w:szCs w:val="36"/>
         </w:rPr>
         <w:t xml:space="preserve">IN 0:43  OUT 1:15  outcue: “still hasn't received it”</w:t>
       </w:r>
@@ -1038,6 +1192,8 @@
           <w:i/>
           <w:iCs/>
           <w:color w:val="1155CC"/>
+          <w:sz w:val="36"/>
+          <w:szCs w:val="36"/>
         </w:rPr>
         <w:t xml:space="preserve">“Missing gifts, misleading tracking: KXAN investigates packages that never arrive”</w:t>
       </w:r>
@@ -1051,6 +1207,8 @@
           <w:i/>
           <w:iCs/>
           <w:color w:val="C0392B"/>
+          <w:sz w:val="36"/>
+          <w:szCs w:val="36"/>
         </w:rPr>
         <w:t xml:space="preserve">⚠ CASE-SWAP: original beat was vertical evidence: Amazon 'delivered' doorbell-cam phantom delivery (no sourceable native clip). Setup lines above rewritten to match the new clip.</w:t>
       </w:r>
@@ -1064,6 +1222,8 @@
           <w:i/>
           <w:iCs/>
           <w:color w:val="1155CC"/>
+          <w:sz w:val="36"/>
+          <w:szCs w:val="36"/>
         </w:rPr>
         <w:t xml:space="preserve">note: about a shipping company (LSO), not Amazon's own delivery scan; setup lines rewritten to the 'packages that never arrive' framing</w:t>
       </w:r>
@@ -1077,6 +1237,8 @@
         <w:rPr>
           <w:b/>
           <w:bCs/>
+          <w:sz w:val="36"/>
+          <w:szCs w:val="36"/>
         </w:rPr>
         <w:t xml:space="preserve">WHEN AMAZON SAYS NO — THE A-TO-Z GUARANTEE</w:t>
       </w:r>
@@ -1090,6 +1252,8 @@
         <w:rPr>
           <w:b w:val="false"/>
           <w:bCs w:val="false"/>
+          <w:sz w:val="36"/>
+          <w:szCs w:val="36"/>
         </w:rPr>
         <w:t xml:space="preserve">-HERE’S SOMETHING MOST PEOPLE DON’T REALIZE ABOUT SHOPPING ON AMAZON.</w:t>
       </w:r>
@@ -1103,6 +1267,8 @@
         <w:rPr>
           <w:b w:val="false"/>
           <w:bCs w:val="false"/>
+          <w:sz w:val="36"/>
+          <w:szCs w:val="36"/>
         </w:rPr>
         <w:t xml:space="preserve">-MOST OF WHAT YOU BUY THERE ISN’T SOLD BY AMAZON — IT’S SOLD BY THIRD-PARTY SELLERS.</w:t>
       </w:r>
@@ -1116,6 +1282,8 @@
         <w:rPr>
           <w:b w:val="false"/>
           <w:bCs w:val="false"/>
+          <w:sz w:val="36"/>
+          <w:szCs w:val="36"/>
         </w:rPr>
         <w:t xml:space="preserve">-AMAZON HAS SAID MORE THAN 60% OF SALES IN ITS STORE COME FROM INDEPENDENT SELLERS.</w:t>
       </w:r>
@@ -1129,6 +1297,8 @@
         <w:rPr>
           <w:b w:val="false"/>
           <w:bCs w:val="false"/>
+          <w:sz w:val="36"/>
+          <w:szCs w:val="36"/>
         </w:rPr>
         <w:t xml:space="preserve">-SO WHEN IT GOES WRONG, PEOPLE GET BOUNCED BETWEEN AMAZON AND A SELLER WHO WON’T ANSWER.</w:t>
       </w:r>
@@ -1142,6 +1312,8 @@
         <w:rPr>
           <w:b w:val="false"/>
           <w:bCs w:val="false"/>
+          <w:sz w:val="36"/>
+          <w:szCs w:val="36"/>
         </w:rPr>
         <w:t xml:space="preserve">-THAT’S WHAT THE A-TO-Z GUARANTEE IS FOR. YOU FILE IT THROUGH YOUR ORDERS PAGE.</w:t>
       </w:r>
@@ -1155,6 +1327,8 @@
         <w:rPr>
           <w:b w:val="false"/>
           <w:bCs w:val="false"/>
+          <w:sz w:val="36"/>
+          <w:szCs w:val="36"/>
         </w:rPr>
         <w:t xml:space="preserve">-AND AMAZON DECIDES THE CLAIM — NOT THE SELLER WHO TOOK YOUR MONEY.</w:t>
       </w:r>
@@ -1168,6 +1342,8 @@
         <w:rPr>
           <w:b w:val="false"/>
           <w:bCs w:val="false"/>
+          <w:sz w:val="36"/>
+          <w:szCs w:val="36"/>
         </w:rPr>
         <w:t xml:space="preserve">-IT COVERS ITEMS THAT NEVER ARRIVED, AND ITEMS THAT ARRIVED DAMAGED OR NOTHING LIKE THE LISTING.</w:t>
       </w:r>
@@ -1181,6 +1357,8 @@
         <w:rPr>
           <w:b w:val="false"/>
           <w:bCs w:val="false"/>
+          <w:sz w:val="36"/>
+          <w:szCs w:val="36"/>
         </w:rPr>
         <w:t xml:space="preserve">-BUT PEOPLE GET DENIED. AND WHEN THEY GET DENIED, THEY GIVE UP.</w:t>
       </w:r>
@@ -1194,6 +1372,8 @@
         <w:rPr>
           <w:b w:val="false"/>
           <w:bCs w:val="false"/>
+          <w:sz w:val="36"/>
+          <w:szCs w:val="36"/>
         </w:rPr>
         <w:t xml:space="preserve">-DON’T GIVE UP.</w:t>
       </w:r>
@@ -1207,6 +1387,8 @@
         <w:rPr>
           <w:b w:val="false"/>
           <w:bCs w:val="false"/>
+          <w:sz w:val="36"/>
+          <w:szCs w:val="36"/>
         </w:rPr>
         <w:t xml:space="preserve">-ESCALATE IT. PUT IT IN WRITING.</w:t>
       </w:r>
@@ -1220,6 +1402,8 @@
         <w:rPr>
           <w:b w:val="false"/>
           <w:bCs w:val="false"/>
+          <w:sz w:val="36"/>
+          <w:szCs w:val="36"/>
         </w:rPr>
         <w:t xml:space="preserve">-LISTEN TO WHAT HAPPENED TO HER.</w:t>
       </w:r>
@@ -1234,6 +1418,8 @@
           <w:b/>
           <w:bCs/>
           <w:color w:val="1155CC"/>
+          <w:sz w:val="36"/>
+          <w:szCs w:val="36"/>
         </w:rPr>
         <w:t xml:space="preserve">▶ CLIP — victim_interview  /  HORIZONTAL</w:t>
       </w:r>
@@ -1245,13 +1431,17 @@
       <w:r>
         <w:rPr>
           <w:color w:val="1155CC"/>
+          <w:sz w:val="36"/>
+          <w:szCs w:val="36"/>
         </w:rPr>
         <w:t xml:space="preserve">Source: WSPA 7News (affiliate, youtube)  —  </w:t>
       </w:r>
-      <w:hyperlink w:history="1" r:id="rIdnyjlicwsmemio1vk0mkdd">
+      <w:hyperlink w:history="1" r:id="rIdbrmontatcvl29c2uf2sw3">
         <w:r>
           <w:rPr>
             <w:color w:val="1155CC"/>
+            <w:sz w:val="36"/>
+            <w:szCs w:val="36"/>
             <w:u w:val="single"/>
           </w:rPr>
           <w:t xml:space="preserve">https://www.youtube.com/watch?v=IuxwwAdVGB8</w:t>
@@ -1267,6 +1457,8 @@
           <w:b/>
           <w:bCs/>
           <w:color w:val="1155CC"/>
+          <w:sz w:val="36"/>
+          <w:szCs w:val="36"/>
         </w:rPr>
         <w:t xml:space="preserve">IN 0:34  OUT 0:55  outcue: “reimburse us”</w:t>
       </w:r>
@@ -1280,6 +1472,8 @@
           <w:i/>
           <w:iCs/>
           <w:color w:val="1155CC"/>
+          <w:sz w:val="36"/>
+          <w:szCs w:val="36"/>
         </w:rPr>
         <w:t xml:space="preserve">“Amazon buyers warn watch out for the "empty box" scam”</w:t>
       </w:r>
@@ -1293,6 +1487,8 @@
           <w:i/>
           <w:iCs/>
           <w:color w:val="1155CC"/>
+          <w:sz w:val="36"/>
+          <w:szCs w:val="36"/>
         </w:rPr>
         <w:t xml:space="preserve">note: not literally an A-to-Z claim denial; it is the adjacent third-party-seller no-refund case</w:t>
       </w:r>
@@ -1306,6 +1502,8 @@
         <w:rPr>
           <w:b/>
           <w:bCs/>
+          <w:sz w:val="36"/>
+          <w:szCs w:val="36"/>
         </w:rPr>
         <w:t xml:space="preserve">AND NOW — THE $2.5 BILLION CHECK</w:t>
       </w:r>
@@ -1319,6 +1517,8 @@
         <w:rPr>
           <w:b w:val="false"/>
           <w:bCs w:val="false"/>
+          <w:sz w:val="36"/>
+          <w:szCs w:val="36"/>
         </w:rPr>
         <w:t xml:space="preserve">-THIS IS THE BIGGEST ONE, AND THE CLOCK ON PART OF IT HAS ALREADY RUN OUT.</w:t>
       </w:r>
@@ -1332,6 +1532,8 @@
         <w:rPr>
           <w:b w:val="false"/>
           <w:bCs w:val="false"/>
+          <w:sz w:val="36"/>
+          <w:szCs w:val="36"/>
         </w:rPr>
         <w:t xml:space="preserve">-IN SEPTEMBER 2025, AMAZON SETTLED WITH THE FEDERAL TRADE COMMISSION FOR $2.5 BILLION.</w:t>
       </w:r>
@@ -1345,6 +1547,8 @@
         <w:rPr>
           <w:b w:val="false"/>
           <w:bCs w:val="false"/>
+          <w:sz w:val="36"/>
+          <w:szCs w:val="36"/>
         </w:rPr>
         <w:t xml:space="preserve">-THE F-T-C ALLEGED AMAZON ENROLLED TENS OF MILLIONS OF PEOPLE IN PRIME WITHOUT THEIR CONSENT…</w:t>
       </w:r>
@@ -1358,6 +1562,8 @@
         <w:rPr>
           <w:b w:val="false"/>
           <w:bCs w:val="false"/>
+          <w:sz w:val="36"/>
+          <w:szCs w:val="36"/>
         </w:rPr>
         <w:t xml:space="preserve">-AND MADE IT DELIBERATELY HARD TO CANCEL. AMAZON DID NOT ADMIT WRONGDOING.</w:t>
       </w:r>
@@ -1371,6 +1577,8 @@
         <w:rPr>
           <w:b w:val="false"/>
           <w:bCs w:val="false"/>
+          <w:sz w:val="36"/>
+          <w:szCs w:val="36"/>
         </w:rPr>
         <w:t xml:space="preserve">-$1 BILLION IS A CIVIL PENALTY. $1.5 BILLION GOES BACK TO CUSTOMERS.</w:t>
       </w:r>
@@ -1384,6 +1592,8 @@
         <w:rPr>
           <w:b w:val="false"/>
           <w:bCs w:val="false"/>
+          <w:sz w:val="36"/>
+          <w:szCs w:val="36"/>
         </w:rPr>
         <w:t xml:space="preserve">-THE F-T-C ESTIMATES ABOUT 35 MILLION PEOPLE WERE HARMED.</w:t>
       </w:r>
@@ -1397,6 +1607,8 @@
         <w:rPr>
           <w:b w:val="false"/>
           <w:bCs w:val="false"/>
+          <w:sz w:val="36"/>
+          <w:szCs w:val="36"/>
         </w:rPr>
         <w:t xml:space="preserve">-IF YOU QUALIFIED AUTOMATICALLY, AMAZON ALREADY PAID YOU BACK IN NOVEMBER AND DECEMBER.</w:t>
       </w:r>
@@ -1410,6 +1622,8 @@
         <w:rPr>
           <w:b w:val="false"/>
           <w:bCs w:val="false"/>
+          <w:sz w:val="36"/>
+          <w:szCs w:val="36"/>
         </w:rPr>
         <w:t xml:space="preserve">-UP TO $51, BY PAYPAL, VENMO, OR A MAILED CHECK.</w:t>
       </w:r>
@@ -1423,6 +1637,8 @@
         <w:rPr>
           <w:b w:val="false"/>
           <w:bCs w:val="false"/>
+          <w:sz w:val="36"/>
+          <w:szCs w:val="36"/>
         </w:rPr>
         <w:t xml:space="preserve">-EVERYONE ELSE GOT A CLAIM NOTICE BY MAIL OR EMAIL IN JANUARY.</w:t>
       </w:r>
@@ -1436,6 +1652,8 @@
         <w:rPr>
           <w:b w:val="false"/>
           <w:bCs w:val="false"/>
+          <w:sz w:val="36"/>
+          <w:szCs w:val="36"/>
         </w:rPr>
         <w:t xml:space="preserve">-AND THAT CLAIM WINDOW CLOSED ON JULY 27TH.</w:t>
       </w:r>
@@ -1449,6 +1667,8 @@
         <w:rPr>
           <w:b w:val="false"/>
           <w:bCs w:val="false"/>
+          <w:sz w:val="36"/>
+          <w:szCs w:val="36"/>
         </w:rPr>
         <w:t xml:space="preserve">-IF YOU FILED, IT’S COMING.</w:t>
       </w:r>
@@ -1462,6 +1682,8 @@
         <w:rPr>
           <w:b w:val="false"/>
           <w:bCs w:val="false"/>
+          <w:sz w:val="36"/>
+          <w:szCs w:val="36"/>
         </w:rPr>
         <w:t xml:space="preserve">-PAYMENTS ARE DUE OUT BY SEPTEMBER. SO WATCH YOUR MAIL AND WATCH YOUR PAYPAL.</w:t>
       </w:r>
@@ -1475,6 +1697,8 @@
         <w:rPr>
           <w:b w:val="false"/>
           <w:bCs w:val="false"/>
+          <w:sz w:val="36"/>
+          <w:szCs w:val="36"/>
         </w:rPr>
         <w:t xml:space="preserve">-HERE’S WHAT WE KNOW RIGHT NOW.</w:t>
       </w:r>
@@ -1489,6 +1713,8 @@
           <w:b/>
           <w:bCs/>
           <w:color w:val="1155CC"/>
+          <w:sz w:val="36"/>
+          <w:szCs w:val="36"/>
         </w:rPr>
         <w:t xml:space="preserve">▶ CLIP — authority_report  /  HORIZONTAL</w:t>
       </w:r>
@@ -1500,13 +1726,17 @@
       <w:r>
         <w:rPr>
           <w:color w:val="1155CC"/>
+          <w:sz w:val="36"/>
+          <w:szCs w:val="36"/>
         </w:rPr>
         <w:t xml:space="preserve">Source: ABC News (network, youtube)  —  </w:t>
       </w:r>
-      <w:hyperlink w:history="1" r:id="rIdsjogmcz3qobwbvh0zpjl_">
+      <w:hyperlink w:history="1" r:id="rId2kuqam3uiz7xcz8byizn6">
         <w:r>
           <w:rPr>
             <w:color w:val="1155CC"/>
+            <w:sz w:val="36"/>
+            <w:szCs w:val="36"/>
             <w:u w:val="single"/>
           </w:rPr>
           <w:t xml:space="preserve">https://www.youtube.com/watch?v=zTgyswYFvsY</w:t>
@@ -1522,6 +1752,8 @@
           <w:b/>
           <w:bCs/>
           <w:color w:val="1155CC"/>
+          <w:sz w:val="36"/>
+          <w:szCs w:val="36"/>
         </w:rPr>
         <w:t xml:space="preserve">IN 0:16  OUT 1:00  outcue: “get a check in the mail”</w:t>
       </w:r>
@@ -1535,6 +1767,8 @@
           <w:i/>
           <w:iCs/>
           <w:color w:val="1155CC"/>
+          <w:sz w:val="36"/>
+          <w:szCs w:val="36"/>
         </w:rPr>
         <w:t xml:space="preserve">“Amazon issuing checks to eligible Prime members”</w:t>
       </w:r>
@@ -1554,6 +1788,8 @@
         <w:rPr>
           <w:b/>
           <w:bCs/>
+          <w:sz w:val="36"/>
+          <w:szCs w:val="36"/>
         </w:rPr>
         <w:t xml:space="preserve">NOW — THE SIZE OF THESE CHECKS  </w:t>
       </w:r>
@@ -1562,8 +1798,8 @@
           <w:i/>
           <w:iCs/>
           <w:color w:val="C0392B"/>
-          <w:sz w:val="16"/>
-          <w:szCs w:val="16"/>
+          <w:sz w:val="36"/>
+          <w:szCs w:val="36"/>
         </w:rPr>
         <w:t xml:space="preserve">[[SWAP: was vertical 'people posting payouts' reaction]]</w:t>
       </w:r>
@@ -1577,6 +1813,8 @@
         <w:rPr>
           <w:b w:val="false"/>
           <w:bCs w:val="false"/>
+          <w:sz w:val="36"/>
+          <w:szCs w:val="36"/>
         </w:rPr>
         <w:t xml:space="preserve">-NOW… ABOUT THE SIZE OF THESE CHECKS.</w:t>
       </w:r>
@@ -1589,6 +1827,8 @@
         <w:rPr>
           <w:b w:val="false"/>
           <w:bCs w:val="false"/>
+          <w:sz w:val="36"/>
+          <w:szCs w:val="36"/>
         </w:rPr>
         <w:t xml:space="preserve">-$51 IS THE MAXIMUM. IT IS NOT WHAT EVERYBODY GETS.</w:t>
       </w:r>
@@ -1601,6 +1841,8 @@
         <w:rPr>
           <w:b w:val="false"/>
           <w:bCs w:val="false"/>
+          <w:sz w:val="36"/>
+          <w:szCs w:val="36"/>
         </w:rPr>
         <w:t xml:space="preserve">-YOU GET BACK THE PRIME FEES YOU ACTUALLY PAID, MINUS ANY REFUNDS OR CREDITS YOU ALREADY GOT.</w:t>
       </w:r>
@@ -1613,6 +1855,8 @@
         <w:rPr>
           <w:b w:val="false"/>
           <w:bCs w:val="false"/>
+          <w:sz w:val="36"/>
+          <w:szCs w:val="36"/>
         </w:rPr>
         <w:t xml:space="preserve">-SO IF YOU SIGNED UP ON A CHEAP TRIAL, YOUR CHECK COULD BE A COUPLE OF DOLLARS. OR LESS.</w:t>
       </w:r>
@@ -1625,6 +1869,8 @@
         <w:rPr>
           <w:b w:val="false"/>
           <w:bCs w:val="false"/>
+          <w:sz w:val="36"/>
+          <w:szCs w:val="36"/>
         </w:rPr>
         <w:t xml:space="preserve">-AND IF A CHECK OR EMAIL SHOWS UP FROM AMAZON — DON'T ASSUME IT'S A SCAM. HERE'S HOW TO KNOW YOURS IS REAL.</w:t>
       </w:r>
@@ -1638,6 +1884,8 @@
           <w:b/>
           <w:bCs/>
           <w:color w:val="C0392B"/>
+          <w:sz w:val="36"/>
+          <w:szCs w:val="36"/>
         </w:rPr>
         <w:t xml:space="preserve">▶ CLIP (CASE-SWAP) — authority_report  /  HORIZONTAL</w:t>
       </w:r>
@@ -1649,13 +1897,17 @@
       <w:r>
         <w:rPr>
           <w:color w:val="1155CC"/>
+          <w:sz w:val="36"/>
+          <w:szCs w:val="36"/>
         </w:rPr>
         <w:t xml:space="preserve">Source: WUSA9 (affiliate, youtube)  —  </w:t>
       </w:r>
-      <w:hyperlink w:history="1" r:id="rId4dchnb-q3lg-ym11frvux">
+      <w:hyperlink w:history="1" r:id="rIdhdkfz9xbbbmnp60wlt27_">
         <w:r>
           <w:rPr>
             <w:color w:val="1155CC"/>
+            <w:sz w:val="36"/>
+            <w:szCs w:val="36"/>
             <w:u w:val="single"/>
           </w:rPr>
           <w:t xml:space="preserve">https://www.youtube.com/watch?v=IOqVtw1War4</w:t>
@@ -1671,6 +1923,8 @@
           <w:b/>
           <w:bCs/>
           <w:color w:val="1155CC"/>
+          <w:sz w:val="36"/>
+          <w:szCs w:val="36"/>
         </w:rPr>
         <w:t xml:space="preserve">IN 0:03  OUT 0:30  outcue: “capped at $51”</w:t>
       </w:r>
@@ -1684,6 +1938,8 @@
           <w:i/>
           <w:iCs/>
           <w:color w:val="1155CC"/>
+          <w:sz w:val="36"/>
+          <w:szCs w:val="36"/>
         </w:rPr>
         <w:t xml:space="preserve">“Amazon settlement checks: Where's the money?”</w:t>
       </w:r>
@@ -1697,6 +1953,8 @@
           <w:i/>
           <w:iCs/>
           <w:color w:val="C0392B"/>
+          <w:sz w:val="36"/>
+          <w:szCs w:val="36"/>
         </w:rPr>
         <w:t xml:space="preserve">⚠ CASE-SWAP: original beat was vertical first_person_rant: people posting tiny settlement payouts 'under a dollar' (native-social gap). Setup lines above rewritten to match the new clip.</w:t>
       </w:r>
@@ -1710,6 +1968,8 @@
           <w:i/>
           <w:iCs/>
           <w:color w:val="1155CC"/>
+          <w:sz w:val="36"/>
+          <w:szCs w:val="36"/>
         </w:rPr>
         <w:t xml:space="preserve">note: does not show the 'under a dollar' payouts; re-framed to 'here's what the checks are and how to know yours is real'</w:t>
       </w:r>
@@ -1723,6 +1983,8 @@
         <w:rPr>
           <w:b/>
           <w:bCs/>
+          <w:sz w:val="36"/>
+          <w:szCs w:val="36"/>
         </w:rPr>
         <w:t xml:space="preserve">DID YOU EVER TRY TO CANCEL PRIME… AND SOMEHOW NOT CANCEL?</w:t>
       </w:r>
@@ -1736,6 +1998,8 @@
         <w:rPr>
           <w:b w:val="false"/>
           <w:bCs w:val="false"/>
+          <w:sz w:val="36"/>
+          <w:szCs w:val="36"/>
         </w:rPr>
         <w:t xml:space="preserve">-BECAUSE THAT IS A HUGE PART OF THIS CASE, AND PEOPLE FORGET IT COUNTS.</w:t>
       </w:r>
@@ -1749,6 +2013,8 @@
         <w:rPr>
           <w:b w:val="false"/>
           <w:bCs w:val="false"/>
+          <w:sz w:val="36"/>
+          <w:szCs w:val="36"/>
         </w:rPr>
         <w:t xml:space="preserve">-SIGNED UP BETWEEN 2019 AND 2025? SOME OF THOSE SIGNUP SCREENS ARE PART OF THIS SETTLEMENT.</w:t>
       </w:r>
@@ -1762,6 +2028,8 @@
         <w:rPr>
           <w:b w:val="false"/>
           <w:bCs w:val="false"/>
+          <w:sz w:val="36"/>
+          <w:szCs w:val="36"/>
         </w:rPr>
         <w:t xml:space="preserve">-TRANSLATION — THE SCREEN WHERE YOU THOUGHT YOU WERE JUST PICKING FASTER SHIPPING.</w:t>
       </w:r>
@@ -1775,6 +2043,8 @@
         <w:rPr>
           <w:b w:val="false"/>
           <w:bCs w:val="false"/>
+          <w:sz w:val="36"/>
+          <w:szCs w:val="36"/>
         </w:rPr>
         <w:t xml:space="preserve">-BUT HERE IS THE DETAIL THAT GOT ME. READ THIS ONE TWICE.</w:t>
       </w:r>
@@ -1788,6 +2058,8 @@
         <w:rPr>
           <w:b w:val="false"/>
           <w:bCs w:val="false"/>
+          <w:sz w:val="36"/>
+          <w:szCs w:val="36"/>
         </w:rPr>
         <w:t xml:space="preserve">-DID YOU EVER TRY TO CANCEL… AND THEY OFFERED YOU A DISCOUNT TO STAY?</w:t>
       </w:r>
@@ -1801,6 +2073,8 @@
         <w:rPr>
           <w:b w:val="false"/>
           <w:bCs w:val="false"/>
+          <w:sz w:val="36"/>
+          <w:szCs w:val="36"/>
         </w:rPr>
         <w:t xml:space="preserve">-AND YOU TOOK IT, WHEN YOU MEANT TO WALK AWAY?</w:t>
       </w:r>
@@ -1814,6 +2088,8 @@
         <w:rPr>
           <w:b w:val="false"/>
           <w:bCs w:val="false"/>
+          <w:sz w:val="36"/>
+          <w:szCs w:val="36"/>
         </w:rPr>
         <w:t xml:space="preserve">-THAT COUNTS. THAT IS A FAILED CANCELLATION.</w:t>
       </w:r>
@@ -1827,6 +2103,8 @@
         <w:rPr>
           <w:b w:val="false"/>
           <w:bCs w:val="false"/>
+          <w:sz w:val="36"/>
+          <w:szCs w:val="36"/>
         </w:rPr>
         <w:t xml:space="preserve">-YOU DON’T HAVE TO PROVE IT. THE CLAIMS ADMINISTRATOR DOES THAT PART FOR YOU.</w:t>
       </w:r>
@@ -1840,6 +2118,8 @@
         <w:rPr>
           <w:b w:val="false"/>
           <w:bCs w:val="false"/>
+          <w:sz w:val="36"/>
+          <w:szCs w:val="36"/>
         </w:rPr>
         <w:t xml:space="preserve">-GO LOOK AT YOUR EMAIL AND YOUR MAIL FROM JANUARY. THAT NOTICE IS YOUR TICKET.</w:t>
       </w:r>
@@ -1853,6 +2133,8 @@
         <w:rPr>
           <w:b w:val="false"/>
           <w:bCs w:val="false"/>
+          <w:sz w:val="36"/>
+          <w:szCs w:val="36"/>
         </w:rPr>
         <w:t xml:space="preserve">(((CREATE FULL SCREEN GRAPHIC XXX)))</w:t>
       </w:r>
@@ -1866,6 +2148,8 @@
         <w:rPr>
           <w:b/>
           <w:bCs/>
+          <w:sz w:val="36"/>
+          <w:szCs w:val="36"/>
         </w:rPr>
         <w:t xml:space="preserve">YOU MAY QUALIFY IF YOU:</w:t>
       </w:r>
@@ -1878,6 +2162,8 @@
         <w:rPr>
           <w:b/>
           <w:bCs/>
+          <w:sz w:val="36"/>
+          <w:szCs w:val="36"/>
         </w:rPr>
         <w:t xml:space="preserve">SIGNED UP JUNE 2019 – JUNE 2025 THROUGH PRIME VIDEO, SINGLE PAGE CHECKOUT,</w:t>
       </w:r>
@@ -1890,6 +2176,8 @@
         <w:rPr>
           <w:b/>
           <w:bCs/>
+          <w:sz w:val="36"/>
+          <w:szCs w:val="36"/>
         </w:rPr>
         <w:t xml:space="preserve">OR THE SHIPPING/PRIME DECISION SCREENS</w:t>
       </w:r>
@@ -1902,6 +2190,8 @@
         <w:rPr>
           <w:b/>
           <w:bCs/>
+          <w:sz w:val="36"/>
+          <w:szCs w:val="36"/>
         </w:rPr>
         <w:t xml:space="preserve">OR TRIED TO CANCEL AND TOOK A “SAVE OFFER” INSTEAD</w:t>
       </w:r>
@@ -1915,6 +2205,8 @@
         <w:rPr>
           <w:b/>
           <w:bCs/>
+          <w:sz w:val="36"/>
+          <w:szCs w:val="36"/>
         </w:rPr>
         <w:t xml:space="preserve">HERE’S HOW TO GET YOUR MONEY</w:t>
       </w:r>
@@ -1928,6 +2220,8 @@
         <w:rPr>
           <w:b w:val="false"/>
           <w:bCs w:val="false"/>
+          <w:sz w:val="36"/>
+          <w:szCs w:val="36"/>
         </w:rPr>
         <w:t xml:space="preserve">-SEARCH YOUR EMAIL FOR THE WORDS GUARANTEED DELIVERY DATE AND SEE WHAT AMAZON PROMISED YOU.</w:t>
       </w:r>
@@ -1941,6 +2235,8 @@
         <w:rPr>
           <w:b w:val="false"/>
           <w:bCs w:val="false"/>
+          <w:sz w:val="36"/>
+          <w:szCs w:val="36"/>
         </w:rPr>
         <w:t xml:space="preserve">-IF THEY MISSED IT, GO TO YOUR ORDERS, CLICK PROBLEM WITH AN ORDER, THEN SHIPMENT IS LATE.</w:t>
       </w:r>
@@ -1954,6 +2250,8 @@
         <w:rPr>
           <w:b w:val="false"/>
           <w:bCs w:val="false"/>
+          <w:sz w:val="36"/>
+          <w:szCs w:val="36"/>
         </w:rPr>
         <w:t xml:space="preserve">-IF YOU’RE A PRIME MEMBER WHO PAID NO SHIPPING, ASK THE AGENT FOR AN ACCOUNT CREDIT INSTEAD.</w:t>
       </w:r>
@@ -1967,6 +2265,8 @@
         <w:rPr>
           <w:b w:val="false"/>
           <w:bCs w:val="false"/>
+          <w:sz w:val="36"/>
+          <w:szCs w:val="36"/>
         </w:rPr>
         <w:t xml:space="preserve">-IF A PACKAGE SAYS DELIVERED AND IT ISN’T THERE, WAIT 48 HOURS, THEN FILE. DON’T JUST EAT IT.</w:t>
       </w:r>
@@ -1980,6 +2280,8 @@
         <w:rPr>
           <w:b w:val="false"/>
           <w:bCs w:val="false"/>
+          <w:sz w:val="36"/>
+          <w:szCs w:val="36"/>
         </w:rPr>
         <w:t xml:space="preserve">-SCREENSHOT THE DELIVERY PHOTO AMAZON SENT YOU AND TAKE YOUR OWN PHOTO OF THE EMPTY PORCH.</w:t>
       </w:r>
@@ -1993,6 +2295,8 @@
         <w:rPr>
           <w:b w:val="false"/>
           <w:bCs w:val="false"/>
+          <w:sz w:val="36"/>
+          <w:szCs w:val="36"/>
         </w:rPr>
         <w:t xml:space="preserve">-FOR A THIRD-PARTY SELLER, FILE AN A-TO-Z GUARANTEE CLAIM THROUGH YOUR ORDERS PAGE.</w:t>
       </w:r>
@@ -2006,6 +2310,8 @@
         <w:rPr>
           <w:b w:val="false"/>
           <w:bCs w:val="false"/>
+          <w:sz w:val="36"/>
+          <w:szCs w:val="36"/>
         </w:rPr>
         <w:t xml:space="preserve">-IF YOU FILED A SETTLEMENT CLAIM, YOUR PAYMENT IS DUE BY SEPTEMBER. THE ADMINISTRATOR HAS 30 DAYS TO REVIEW IT.</w:t>
       </w:r>
@@ -2019,6 +2325,8 @@
         <w:rPr>
           <w:b w:val="false"/>
           <w:bCs w:val="false"/>
+          <w:sz w:val="36"/>
+          <w:szCs w:val="36"/>
         </w:rPr>
         <w:t xml:space="preserve">-THE ONLY OFFICIAL SITE IS SUBSCRIPTIONMEMBERSHIPSETTLEMENT.COM. THE HELP LINE IS 1-888-999-8094.</w:t>
       </w:r>
@@ -2032,6 +2340,8 @@
         <w:rPr>
           <w:b w:val="false"/>
           <w:bCs w:val="false"/>
+          <w:sz w:val="36"/>
+          <w:szCs w:val="36"/>
         </w:rPr>
         <w:t xml:space="preserve">-NO ONE FROM AMAZON OR THE F-T-C WILL EVER ASK YOU TO PAY A FEE TO RELEASE YOUR REFUND.</w:t>
       </w:r>
@@ -2045,6 +2355,8 @@
         <w:rPr>
           <w:b w:val="false"/>
           <w:bCs w:val="false"/>
+          <w:sz w:val="36"/>
+          <w:szCs w:val="36"/>
         </w:rPr>
         <w:t xml:space="preserve">-AND YOU WILL NEVER BE ASKED FOR YOUR SOCIAL SECURITY NUMBER OR YOUR AMAZON PASSWORD. EVER.</w:t>
       </w:r>
@@ -2059,6 +2371,8 @@
         <w:rPr>
           <w:b w:val="false"/>
           <w:bCs w:val="false"/>
+          <w:sz w:val="36"/>
+          <w:szCs w:val="36"/>
         </w:rPr>
         <w:t xml:space="preserve">(((SPONSOR TEASE - KILL BANNERS)))</w:t>
       </w:r>
@@ -2072,6 +2386,8 @@
         <w:rPr>
           <w:b/>
           <w:bCs/>
+          <w:sz w:val="36"/>
+          <w:szCs w:val="36"/>
         </w:rPr>
         <w:t xml:space="preserve">I’M ALWAYS LOOKING FOR WAYS TO PROTECT YOU AND YOUR MONEY…</w:t>
       </w:r>
@@ -2085,6 +2401,8 @@
         <w:rPr>
           <w:b w:val="false"/>
           <w:bCs w:val="false"/>
+          <w:sz w:val="36"/>
+          <w:szCs w:val="36"/>
         </w:rPr>
         <w:t xml:space="preserve">-OUR SPONSOR TODAY DOES JUST THAT.</w:t>
       </w:r>
@@ -2098,6 +2416,8 @@
         <w:rPr>
           <w:b w:val="false"/>
           <w:bCs w:val="false"/>
+          <w:sz w:val="36"/>
+          <w:szCs w:val="36"/>
         </w:rPr>
         <w:t xml:space="preserve">(((PLAY SPONSOR)))</w:t>
       </w:r>
@@ -2112,6 +2432,8 @@
         <w:rPr>
           <w:b/>
           <w:bCs/>
+          <w:sz w:val="36"/>
+          <w:szCs w:val="36"/>
         </w:rPr>
         <w:t xml:space="preserve">THE RECALLED PRODUCTS ALREADY SITTING IN YOUR HOUSE</w:t>
       </w:r>
@@ -2125,6 +2447,8 @@
         <w:rPr>
           <w:b w:val="false"/>
           <w:bCs w:val="false"/>
+          <w:sz w:val="36"/>
+          <w:szCs w:val="36"/>
         </w:rPr>
         <w:t xml:space="preserve">-RIGHT NOW THERE IS A PAGE INSIDE YOUR AMAZON ACCOUNT YOU HAVE PROBABLY NEVER OPENED.</w:t>
       </w:r>
@@ -2138,6 +2462,8 @@
         <w:rPr>
           <w:b w:val="false"/>
           <w:bCs w:val="false"/>
+          <w:sz w:val="36"/>
+          <w:szCs w:val="36"/>
         </w:rPr>
         <w:t xml:space="preserve">-IT’S CALLED YOUR RECALLS AND PRODUCT SAFETY ALERTS.</w:t>
       </w:r>
@@ -2151,6 +2477,8 @@
         <w:rPr>
           <w:b w:val="false"/>
           <w:bCs w:val="false"/>
+          <w:sz w:val="36"/>
+          <w:szCs w:val="36"/>
         </w:rPr>
         <w:t xml:space="preserve">-IT LISTS RECALLS TIED TO THINGS YOU ACTUALLY BOUGHT. YOUR ORDER HISTORY. YOUR HOUSE.</w:t>
       </w:r>
@@ -2164,6 +2492,8 @@
         <w:rPr>
           <w:b w:val="false"/>
           <w:bCs w:val="false"/>
+          <w:sz w:val="36"/>
+          <w:szCs w:val="36"/>
         </w:rPr>
         <w:t xml:space="preserve">-AMAZON SAYS IT CAN REACH 100% OF CUSTOMERS WHO BOUGHT A RECALLED PRODUCT IN ITS STORE.</w:t>
       </w:r>
@@ -2177,6 +2507,8 @@
         <w:rPr>
           <w:b w:val="false"/>
           <w:bCs w:val="false"/>
+          <w:sz w:val="36"/>
+          <w:szCs w:val="36"/>
         </w:rPr>
         <w:t xml:space="preserve">-FEDERAL REGULATORS DISAGREED.</w:t>
       </w:r>
@@ -2190,6 +2522,8 @@
         <w:rPr>
           <w:b w:val="false"/>
           <w:bCs w:val="false"/>
+          <w:sz w:val="36"/>
+          <w:szCs w:val="36"/>
         </w:rPr>
         <w:t xml:space="preserve">-IN A BIG WAY.</w:t>
       </w:r>
@@ -2203,6 +2537,8 @@
         <w:rPr>
           <w:b w:val="false"/>
           <w:bCs w:val="false"/>
+          <w:sz w:val="36"/>
+          <w:szCs w:val="36"/>
         </w:rPr>
         <w:t xml:space="preserve">-IN JULY 2024, THE CONSUMER PRODUCT SAFETY COMMISSION VOTED UNANIMOUSLY THAT AMAZON IS A DISTRIBUTOR.</w:t>
       </w:r>
@@ -2216,6 +2552,8 @@
         <w:rPr>
           <w:b w:val="false"/>
           <w:bCs w:val="false"/>
+          <w:sz w:val="36"/>
+          <w:szCs w:val="36"/>
         </w:rPr>
         <w:t xml:space="preserve">-LEGALLY ON THE HOOK FOR RECALLING DANGEROUS PRODUCTS OTHER PEOPLE SOLD.</w:t>
       </w:r>
@@ -2229,6 +2567,8 @@
         <w:rPr>
           <w:b w:val="false"/>
           <w:bCs w:val="false"/>
+          <w:sz w:val="36"/>
+          <w:szCs w:val="36"/>
         </w:rPr>
         <w:t xml:space="preserve">-MORE THAN 400,000 PRODUCTS WERE COVERED BY THAT ORDER — FAULTY CO DETECTORS, UNSAFE HAIRDRYERS, FLAMMABLE KIDS’ SLEEPWEAR.</w:t>
       </w:r>
@@ -2242,6 +2582,8 @@
         <w:rPr>
           <w:b w:val="false"/>
           <w:bCs w:val="false"/>
+          <w:sz w:val="36"/>
+          <w:szCs w:val="36"/>
         </w:rPr>
         <w:t xml:space="preserve">-THE COMMISSION SAID AMAZON FAILED TO NOTIFY THE PUBLIC, AND LEFT CUSTOMERS AT SUBSTANTIAL RISK OF INJURY.</w:t>
       </w:r>
@@ -2255,6 +2597,8 @@
         <w:rPr>
           <w:b w:val="false"/>
           <w:bCs w:val="false"/>
+          <w:sz w:val="36"/>
+          <w:szCs w:val="36"/>
         </w:rPr>
         <w:t xml:space="preserve">-AMAZON SUED THE C-P-S-C IN MARCH 2025 IN FEDERAL COURT IN MARYLAND.</w:t>
       </w:r>
@@ -2268,6 +2612,8 @@
         <w:rPr>
           <w:b w:val="false"/>
           <w:bCs w:val="false"/>
+          <w:sz w:val="36"/>
+          <w:szCs w:val="36"/>
         </w:rPr>
         <w:t xml:space="preserve">-ITS ARGUMENT: WE’RE A LOGISTICS PROVIDER, NOT A DISTRIBUTOR. THAT FIGHT IS STILL GOING.</w:t>
       </w:r>
@@ -2281,6 +2627,8 @@
         <w:rPr>
           <w:b w:val="false"/>
           <w:bCs w:val="false"/>
+          <w:sz w:val="36"/>
+          <w:szCs w:val="36"/>
         </w:rPr>
         <w:t xml:space="preserve">-I HATE THAT IT TAKES A FEDERAL LAWSUIT TO GET A DANGEROUS PRODUCT OFF THE SHELF.</w:t>
       </w:r>
@@ -2294,6 +2642,8 @@
         <w:rPr>
           <w:b w:val="false"/>
           <w:bCs w:val="false"/>
+          <w:sz w:val="36"/>
+          <w:szCs w:val="36"/>
         </w:rPr>
         <w:t xml:space="preserve">-HERE’S WHAT WE KNOW RIGHT NOW.</w:t>
       </w:r>
@@ -2308,6 +2658,8 @@
           <w:b/>
           <w:bCs/>
           <w:color w:val="1155CC"/>
+          <w:sz w:val="36"/>
+          <w:szCs w:val="36"/>
         </w:rPr>
         <w:t xml:space="preserve">▶ CLIP — authority_report  /  HORIZONTAL</w:t>
       </w:r>
@@ -2319,13 +2671,17 @@
       <w:r>
         <w:rPr>
           <w:color w:val="1155CC"/>
+          <w:sz w:val="36"/>
+          <w:szCs w:val="36"/>
         </w:rPr>
         <w:t xml:space="preserve">Source: WKYC Channel 3 (network, youtube)  —  </w:t>
       </w:r>
-      <w:hyperlink w:history="1" r:id="rIdcwutoghffh2zet4bwgaj7">
+      <w:hyperlink w:history="1" r:id="rIduu2vu0i69g1gk3iudw1gt">
         <w:r>
           <w:rPr>
             <w:color w:val="1155CC"/>
+            <w:sz w:val="36"/>
+            <w:szCs w:val="36"/>
             <w:u w:val="single"/>
           </w:rPr>
           <w:t xml:space="preserve">https://www.youtube.com/watch?v=o_iCvhqaWiI</w:t>
@@ -2341,6 +2697,8 @@
           <w:b/>
           <w:bCs/>
           <w:color w:val="1155CC"/>
+          <w:sz w:val="36"/>
+          <w:szCs w:val="36"/>
         </w:rPr>
         <w:t xml:space="preserve">IN 1:01  OUT 1:41  outcue: “injury or death”</w:t>
       </w:r>
@@ -2354,6 +2712,8 @@
           <w:b/>
           <w:bCs/>
           <w:color w:val="1155CC"/>
+          <w:sz w:val="36"/>
+          <w:szCs w:val="36"/>
         </w:rPr>
         <w:t xml:space="preserve">IN 1:57  OUT 2:22  outcue: “products out of homes”</w:t>
       </w:r>
@@ -2367,6 +2727,8 @@
           <w:i/>
           <w:iCs/>
           <w:color w:val="1155CC"/>
+          <w:sz w:val="36"/>
+          <w:szCs w:val="36"/>
         </w:rPr>
         <w:t xml:space="preserve">“Consumer Reports: Amazon updates rules surrounding recalled items”</w:t>
       </w:r>
@@ -2380,6 +2742,8 @@
           <w:i/>
           <w:iCs/>
           <w:color w:val="1155CC"/>
+          <w:sz w:val="36"/>
+          <w:szCs w:val="36"/>
         </w:rPr>
         <w:t xml:space="preserve">note: Consumer Reports franchise piece; the airable core is 1:01-2:22, the tail drifts into a review-writing tangent</w:t>
       </w:r>
@@ -2393,6 +2757,8 @@
         <w:rPr>
           <w:b/>
           <w:bCs/>
+          <w:sz w:val="36"/>
+          <w:szCs w:val="36"/>
         </w:rPr>
         <w:t xml:space="preserve">IT IS NOT JUST HEATERS — RECALLED LITHIUM BATTERIES THAT CATCH FIRE  </w:t>
       </w:r>
@@ -2401,8 +2767,8 @@
           <w:i/>
           <w:iCs/>
           <w:color w:val="C0392B"/>
-          <w:sz w:val="16"/>
-          <w:szCs w:val="16"/>
+          <w:sz w:val="36"/>
+          <w:szCs w:val="36"/>
         </w:rPr>
         <w:t xml:space="preserve">[[SWAP: was Lakkzoom immersion heater, no video yet]]</w:t>
       </w:r>
@@ -2416,6 +2782,8 @@
         <w:rPr>
           <w:b w:val="false"/>
           <w:bCs w:val="false"/>
+          <w:sz w:val="36"/>
+          <w:szCs w:val="36"/>
         </w:rPr>
         <w:t xml:space="preserve">-THE NEWEST FIRE HAZARD SITTING IN YOUR HOUSE ISN'T A HEATER — IT'S A LITHIUM BATTERY.</w:t>
       </w:r>
@@ -2428,6 +2796,8 @@
         <w:rPr>
           <w:b w:val="false"/>
           <w:bCs w:val="false"/>
+          <w:sz w:val="36"/>
+          <w:szCs w:val="36"/>
         </w:rPr>
         <w:t xml:space="preserve">-ANKER — SOLD ALL OVER AMAZON — JUST RECALLED HUNDREDS OF THOUSANDS OF POWER BANKS.</w:t>
       </w:r>
@@ -2440,6 +2810,8 @@
         <w:rPr>
           <w:b w:val="false"/>
           <w:bCs w:val="false"/>
+          <w:sz w:val="36"/>
+          <w:szCs w:val="36"/>
         </w:rPr>
         <w:t xml:space="preserve">-THE LITHIUM-ION BATTERIES CAN OVERHEAT, CATCH FIRE, AND EVEN EXPLODE.</w:t>
       </w:r>
@@ -2452,6 +2824,8 @@
         <w:rPr>
           <w:b w:val="false"/>
           <w:bCs w:val="false"/>
+          <w:sz w:val="36"/>
+          <w:szCs w:val="36"/>
         </w:rPr>
         <w:t xml:space="preserve">-THE C-P-S-C KNOWS OF DOZENS OF FIRES AND EXPLOSIONS ALREADY — SOME WITH BURNS.</w:t>
       </w:r>
@@ -2464,6 +2838,8 @@
         <w:rPr>
           <w:b w:val="false"/>
           <w:bCs w:val="false"/>
+          <w:sz w:val="36"/>
+          <w:szCs w:val="36"/>
         </w:rPr>
         <w:t xml:space="preserve">-STOP USING THE RECALLED MODELS TODAY. HERE'S WHAT WE KNOW RIGHT NOW.</w:t>
       </w:r>
@@ -2477,6 +2853,8 @@
           <w:b/>
           <w:bCs/>
           <w:color w:val="C0392B"/>
+          <w:sz w:val="36"/>
+          <w:szCs w:val="36"/>
         </w:rPr>
         <w:t xml:space="preserve">▶ CLIP (CASE-SWAP) — authority_report  /  HORIZONTAL</w:t>
       </w:r>
@@ -2488,13 +2866,17 @@
       <w:r>
         <w:rPr>
           <w:color w:val="1155CC"/>
+          <w:sz w:val="36"/>
+          <w:szCs w:val="36"/>
         </w:rPr>
         <w:t xml:space="preserve">Source: KSNT News (affiliate, youtube)  —  </w:t>
       </w:r>
-      <w:hyperlink w:history="1" r:id="rIdexac2sz4sfw5ucchanpph">
+      <w:hyperlink w:history="1" r:id="rIdg574xhd_emalrlj4z7piu">
         <w:r>
           <w:rPr>
             <w:color w:val="1155CC"/>
+            <w:sz w:val="36"/>
+            <w:szCs w:val="36"/>
             <w:u w:val="single"/>
           </w:rPr>
           <w:t xml:space="preserve">https://www.youtube.com/watch?v=N1D4PvPen9w</w:t>
@@ -2510,6 +2892,8 @@
           <w:b/>
           <w:bCs/>
           <w:color w:val="1155CC"/>
+          <w:sz w:val="36"/>
+          <w:szCs w:val="36"/>
         </w:rPr>
         <w:t xml:space="preserve">IN 0:01  OUT 0:37  outcue: “full refund or gift card”</w:t>
       </w:r>
@@ -2523,6 +2907,8 @@
           <w:i/>
           <w:iCs/>
           <w:color w:val="1155CC"/>
+          <w:sz w:val="36"/>
+          <w:szCs w:val="36"/>
         </w:rPr>
         <w:t xml:space="preserve">“Power banks recalled over fire, explosion danger: CPSC”</w:t>
       </w:r>
@@ -2536,6 +2922,8 @@
           <w:i/>
           <w:iCs/>
           <w:color w:val="C0392B"/>
+          <w:sz w:val="36"/>
+          <w:szCs w:val="36"/>
         </w:rPr>
         <w:t xml:space="preserve">⚠ CASE-SWAP: original beat was vertical evidence: Lakkzoom immersion water heater fire (product recalled July 22, no citizen video yet). Setup lines above rewritten to match the new clip.</w:t>
       </w:r>
@@ -2549,6 +2937,8 @@
           <w:i/>
           <w:iCs/>
           <w:color w:val="1155CC"/>
+          <w:sz w:val="36"/>
+          <w:szCs w:val="36"/>
         </w:rPr>
         <w:t xml:space="preserve">note: news readout, not raw fire footage; product changed from Lakkzoom heater to Anker power bank — the 98K units / 235 fires / July 22 specifics are rewritten out of the setup</w:t>
       </w:r>
@@ -2562,6 +2952,8 @@
         <w:rPr>
           <w:b/>
           <w:bCs/>
+          <w:sz w:val="36"/>
+          <w:szCs w:val="36"/>
         </w:rPr>
         <w:t xml:space="preserve">IT IS NOT JUST AMAZON — AND IT IS NOT JUST FIRES</w:t>
       </w:r>
@@ -2575,6 +2967,8 @@
         <w:rPr>
           <w:b w:val="false"/>
           <w:bCs w:val="false"/>
+          <w:sz w:val="36"/>
+          <w:szCs w:val="36"/>
         </w:rPr>
         <w:t xml:space="preserve">-THIS MONTH CONAIR RECALLED MORE THAN ONE MILLION CUISINART GRILL BRUSHES.</w:t>
       </w:r>
@@ -2588,6 +2982,8 @@
         <w:rPr>
           <w:b w:val="false"/>
           <w:bCs w:val="false"/>
+          <w:sz w:val="36"/>
+          <w:szCs w:val="36"/>
         </w:rPr>
         <w:t xml:space="preserve">-THE WIRE BRISTLES BREAK OFF THE BRUSH… AND END UP IN YOUR FOOD.</w:t>
       </w:r>
@@ -2601,6 +2997,8 @@
         <w:rPr>
           <w:b w:val="false"/>
           <w:bCs w:val="false"/>
+          <w:sz w:val="36"/>
+          <w:szCs w:val="36"/>
         </w:rPr>
         <w:t xml:space="preserve">-54 REPORTS OF BRISTLES DETACHING — INCLUDING THREE PEOPLE WHO SWALLOWED THEM…</w:t>
       </w:r>
@@ -2614,6 +3012,8 @@
         <w:rPr>
           <w:b w:val="false"/>
           <w:bCs w:val="false"/>
+          <w:sz w:val="36"/>
+          <w:szCs w:val="36"/>
         </w:rPr>
         <w:t xml:space="preserve">-AND NEEDED MEDICAL TREATMENT TO GET METAL OUT OF THEIR DIGESTIVE TRACT.</w:t>
       </w:r>
@@ -2627,6 +3027,8 @@
         <w:rPr>
           <w:b w:val="false"/>
           <w:bCs w:val="false"/>
+          <w:sz w:val="36"/>
+          <w:szCs w:val="36"/>
         </w:rPr>
         <w:t xml:space="preserve">-THAT BRUSH IS SITTING NEXT TO YOUR GRILL RIGHT NOW.</w:t>
       </w:r>
@@ -2640,6 +3042,8 @@
         <w:rPr>
           <w:b w:val="false"/>
           <w:bCs w:val="false"/>
+          <w:sz w:val="36"/>
+          <w:szCs w:val="36"/>
         </w:rPr>
         <w:t xml:space="preserve">-TREATLIFE SMOKE AND CARBON MONOXIDE DETECTORS, SOLD EXCLUSIVELY ON AMAZON, WERE RECALLED…</w:t>
       </w:r>
@@ -2653,6 +3057,8 @@
         <w:rPr>
           <w:b w:val="false"/>
           <w:bCs w:val="false"/>
+          <w:sz w:val="36"/>
+          <w:szCs w:val="36"/>
         </w:rPr>
         <w:t xml:space="preserve">-BECAUSE THEY CAN FAIL TO ALERT YOU TO A FIRE. A SMOKE DETECTOR THAT DOESN’T DETECT SMOKE.</w:t>
       </w:r>
@@ -2666,6 +3072,8 @@
         <w:rPr>
           <w:b w:val="false"/>
           <w:bCs w:val="false"/>
+          <w:sz w:val="36"/>
+          <w:szCs w:val="36"/>
         </w:rPr>
         <w:t xml:space="preserve">-FABRIC DRESSERS SOLD ON WALMART.COM AND AMAZON WERE RECALLED FOR TIP-OVER HAZARDS.</w:t>
       </w:r>
@@ -2679,6 +3087,8 @@
         <w:rPr>
           <w:b w:val="false"/>
           <w:bCs w:val="false"/>
+          <w:sz w:val="36"/>
+          <w:szCs w:val="36"/>
         </w:rPr>
         <w:t xml:space="preserve">-THIS IS EVERY RETAILER YOU SHOP AT.</w:t>
       </w:r>
@@ -2692,6 +3102,8 @@
         <w:rPr>
           <w:b w:val="false"/>
           <w:bCs w:val="false"/>
+          <w:sz w:val="36"/>
+          <w:szCs w:val="36"/>
         </w:rPr>
         <w:t xml:space="preserve">-NOT ONE.</w:t>
       </w:r>
@@ -2705,6 +3117,8 @@
         <w:rPr>
           <w:b w:val="false"/>
           <w:bCs w:val="false"/>
+          <w:sz w:val="36"/>
+          <w:szCs w:val="36"/>
         </w:rPr>
         <w:t xml:space="preserve">-HERE YOU CAN SEE WHAT HAPPENS WHEN ONE OF THESE THINGS LETS GO.</w:t>
       </w:r>
@@ -2719,6 +3133,8 @@
           <w:b/>
           <w:bCs/>
           <w:color w:val="1155CC"/>
+          <w:sz w:val="36"/>
+          <w:szCs w:val="36"/>
         </w:rPr>
         <w:t xml:space="preserve">▶ CLIP — evidence  /  HORIZONTAL</w:t>
       </w:r>
@@ -2730,13 +3146,17 @@
       <w:r>
         <w:rPr>
           <w:color w:val="1155CC"/>
+          <w:sz w:val="36"/>
+          <w:szCs w:val="36"/>
         </w:rPr>
         <w:t xml:space="preserve">Source: WKBN27 (affiliate, youtube)  —  </w:t>
       </w:r>
-      <w:hyperlink w:history="1" r:id="rIdfily7onahxn4kzwlmhoi-">
+      <w:hyperlink w:history="1" r:id="rIdx88vnrfqgmyrkg_yqlqqj">
         <w:r>
           <w:rPr>
             <w:color w:val="1155CC"/>
+            <w:sz w:val="36"/>
+            <w:szCs w:val="36"/>
             <w:u w:val="single"/>
           </w:rPr>
           <w:t xml:space="preserve">https://www.youtube.com/watch?v=j7i0NTk3Qwk</w:t>
@@ -2752,6 +3172,8 @@
           <w:b/>
           <w:bCs/>
           <w:color w:val="1155CC"/>
+          <w:sz w:val="36"/>
+          <w:szCs w:val="36"/>
         </w:rPr>
         <w:t xml:space="preserve">IN 0:01  OUT 0:37  outcue: “off the market”</w:t>
       </w:r>
@@ -2765,6 +3187,8 @@
           <w:i/>
           <w:iCs/>
           <w:color w:val="1155CC"/>
+          <w:sz w:val="36"/>
+          <w:szCs w:val="36"/>
         </w:rPr>
         <w:t xml:space="preserve">“Guilford Lake woman recovering after swallowing a grill brush bristle”</w:t>
       </w:r>
@@ -2778,6 +3202,8 @@
           <w:i/>
           <w:iCs/>
           <w:color w:val="1155CC"/>
+          <w:sz w:val="36"/>
+          <w:szCs w:val="36"/>
         </w:rPr>
         <w:t xml:space="preserve">note: victim is about a grill brush generally, not the specific Cuisinart/Conair recalled model; the injury is the point</w:t>
       </w:r>
@@ -2791,6 +3217,8 @@
         <w:rPr>
           <w:b w:val="false"/>
           <w:bCs w:val="false"/>
+          <w:sz w:val="36"/>
+          <w:szCs w:val="36"/>
         </w:rPr>
         <w:t xml:space="preserve">(((CREATE FULL SCREEN GRAPHIC XXX)))</w:t>
       </w:r>
@@ -2804,6 +3232,8 @@
         <w:rPr>
           <w:b/>
           <w:bCs/>
+          <w:sz w:val="36"/>
+          <w:szCs w:val="36"/>
         </w:rPr>
         <w:t xml:space="preserve">CHECK YOUR ORDER HISTORY TONIGHT:</w:t>
       </w:r>
@@ -2816,6 +3246,8 @@
         <w:rPr>
           <w:b/>
           <w:bCs/>
+          <w:sz w:val="36"/>
+          <w:szCs w:val="36"/>
         </w:rPr>
         <w:t xml:space="preserve">AMAZON.COM/PRODUCT-SAFETY-ALERTS</w:t>
       </w:r>
@@ -2828,6 +3260,8 @@
         <w:rPr>
           <w:b/>
           <w:bCs/>
+          <w:sz w:val="36"/>
+          <w:szCs w:val="36"/>
         </w:rPr>
         <w:t xml:space="preserve">YOUR ORDERS → YOUR RECALLS AND PRODUCT SAFETY ALERTS</w:t>
       </w:r>
@@ -2840,6 +3274,8 @@
         <w:rPr>
           <w:b/>
           <w:bCs/>
+          <w:sz w:val="36"/>
+          <w:szCs w:val="36"/>
         </w:rPr>
         <w:t xml:space="preserve">CPSC.GOV/RECALLS</w:t>
       </w:r>
@@ -2853,6 +3289,8 @@
         <w:rPr>
           <w:b/>
           <w:bCs/>
+          <w:sz w:val="36"/>
+          <w:szCs w:val="36"/>
         </w:rPr>
         <w:t xml:space="preserve">HERE’S HOW TO PROTECT YOURSELF</w:t>
       </w:r>
@@ -2866,6 +3304,8 @@
         <w:rPr>
           <w:b w:val="false"/>
           <w:bCs w:val="false"/>
+          <w:sz w:val="36"/>
+          <w:szCs w:val="36"/>
         </w:rPr>
         <w:t xml:space="preserve">-GO TO AMAZON.COM/PRODUCT-SAFETY-ALERTS AND CHECK IT TONIGHT. IT TAKES A MINUTE.</w:t>
       </w:r>
@@ -2879,6 +3319,8 @@
         <w:rPr>
           <w:b w:val="false"/>
           <w:bCs w:val="false"/>
+          <w:sz w:val="36"/>
+          <w:szCs w:val="36"/>
         </w:rPr>
         <w:t xml:space="preserve">-WHILE YOU’RE LOGGED IN, OPEN YOUR RECALLS AND PRODUCT SAFETY ALERTS OFF YOUR ORDERS PAGE.</w:t>
       </w:r>
@@ -2892,6 +3334,8 @@
         <w:rPr>
           <w:b w:val="false"/>
           <w:bCs w:val="false"/>
+          <w:sz w:val="36"/>
+          <w:szCs w:val="36"/>
         </w:rPr>
         <w:t xml:space="preserve">-THEN SEARCH YOUR PRODUCTS BY NAME AT CPSC.GOV/RECALLS — SIGN UP FOR FREE RECALL EMAILS WHILE YOU’RE THERE.</w:t>
       </w:r>
@@ -2905,6 +3349,8 @@
         <w:rPr>
           <w:b w:val="false"/>
           <w:bCs w:val="false"/>
+          <w:sz w:val="36"/>
+          <w:szCs w:val="36"/>
         </w:rPr>
         <w:t xml:space="preserve">-IF YOU OWN A RECALLED PRODUCT, STOP USING IT TODAY. NOT THIS WEEKEND. TODAY.</w:t>
       </w:r>
@@ -2918,6 +3364,8 @@
         <w:rPr>
           <w:b w:val="false"/>
           <w:bCs w:val="false"/>
+          <w:sz w:val="36"/>
+          <w:szCs w:val="36"/>
         </w:rPr>
         <w:t xml:space="preserve">-DO NOT RESELL IT ON FACEBOOK MARKETPLACE AND DO NOT GIVE IT AWAY. THAT IS AGAINST FEDERAL LAW.</w:t>
       </w:r>
@@ -2931,6 +3379,8 @@
         <w:rPr>
           <w:b w:val="false"/>
           <w:bCs w:val="false"/>
+          <w:sz w:val="36"/>
+          <w:szCs w:val="36"/>
         </w:rPr>
         <w:t xml:space="preserve">-YOU ARE USUALLY ENTITLED TO A REFUND, A REPLACEMENT, OR A REPAIR. ASK FOR IT.</w:t>
       </w:r>
@@ -2944,6 +3394,8 @@
         <w:rPr>
           <w:b w:val="false"/>
           <w:bCs w:val="false"/>
+          <w:sz w:val="36"/>
+          <w:szCs w:val="36"/>
         </w:rPr>
         <w:t xml:space="preserve">-REPORT ANY FIRE OR INJURY AT SAFERPRODUCTS.GOV — THAT REPORT IS HOW THE NEXT RECALL STARTS.</w:t>
       </w:r>
@@ -2957,6 +3409,8 @@
         <w:rPr>
           <w:b w:val="false"/>
           <w:bCs w:val="false"/>
+          <w:sz w:val="36"/>
+          <w:szCs w:val="36"/>
         </w:rPr>
         <w:t xml:space="preserve">-THE C-P-S-C HOTLINE IS 1-800-638-2772.</w:t>
       </w:r>
@@ -2971,6 +3425,8 @@
         <w:rPr>
           <w:b/>
           <w:bCs/>
+          <w:sz w:val="36"/>
+          <w:szCs w:val="36"/>
         </w:rPr>
         <w:t xml:space="preserve">THE FAKE RECALL TEXT THAT DRAINS YOUR BANK ACCOUNT</w:t>
       </w:r>
@@ -2984,6 +3440,8 @@
         <w:rPr>
           <w:b w:val="false"/>
           <w:bCs w:val="false"/>
+          <w:sz w:val="36"/>
+          <w:szCs w:val="36"/>
         </w:rPr>
         <w:t xml:space="preserve">-EVERYTHING WE JUST TOLD YOU… SCAMMERS ALREADY KNOW IT.</w:t>
       </w:r>
@@ -2997,6 +3455,8 @@
         <w:rPr>
           <w:b w:val="false"/>
           <w:bCs w:val="false"/>
+          <w:sz w:val="36"/>
+          <w:szCs w:val="36"/>
         </w:rPr>
         <w:t xml:space="preserve">-THEY READ THE SAME RECALL HEADLINES AND THE SAME SETTLEMENT HEADLINES YOU DO.</w:t>
       </w:r>
@@ -3010,6 +3470,8 @@
         <w:rPr>
           <w:b w:val="false"/>
           <w:bCs w:val="false"/>
+          <w:sz w:val="36"/>
+          <w:szCs w:val="36"/>
         </w:rPr>
         <w:t xml:space="preserve">-AND THEY BUILT A TEXT MESSAGE AROUND BOTH OF THEM.</w:t>
       </w:r>
@@ -3023,6 +3485,8 @@
         <w:rPr>
           <w:b w:val="false"/>
           <w:bCs w:val="false"/>
+          <w:sz w:val="36"/>
+          <w:szCs w:val="36"/>
         </w:rPr>
         <w:t xml:space="preserve">-THE F-T-C IS WARNING ABOUT A TEXT THAT LOOKS LIKE IT CAME STRAIGHT FROM AMAZON.</w:t>
       </w:r>
@@ -3036,6 +3500,8 @@
         <w:rPr>
           <w:b w:val="false"/>
           <w:bCs w:val="false"/>
+          <w:sz w:val="36"/>
+          <w:szCs w:val="36"/>
         </w:rPr>
         <w:t xml:space="preserve">-IT SAYS AMAZON RAN A ROUTINE QUALITY INSPECTION ON SOMETHING YOU BOUGHT…</w:t>
       </w:r>
@@ -3049,6 +3515,8 @@
         <w:rPr>
           <w:b w:val="false"/>
           <w:bCs w:val="false"/>
+          <w:sz w:val="36"/>
+          <w:szCs w:val="36"/>
         </w:rPr>
         <w:t xml:space="preserve">-AND THAT THE ITEM DOESN’T MEET AMAZON’S STANDARDS… OR HAS BEEN RECALLED.</w:t>
       </w:r>
@@ -3062,6 +3530,8 @@
         <w:rPr>
           <w:b w:val="false"/>
           <w:bCs w:val="false"/>
+          <w:sz w:val="36"/>
+          <w:szCs w:val="36"/>
         </w:rPr>
         <w:t xml:space="preserve">-THEN COMES THE HOOK. A FULL REFUND. AND YOU DON’T EVEN HAVE TO SEND IT BACK.</w:t>
       </w:r>
@@ -3075,6 +3545,8 @@
         <w:rPr>
           <w:b w:val="false"/>
           <w:bCs w:val="false"/>
+          <w:sz w:val="36"/>
+          <w:szCs w:val="36"/>
         </w:rPr>
         <w:t xml:space="preserve">-THAT IS BRILLIANT, AND IT IS EVIL, AND HERE IS WHY IT WORKS.</w:t>
       </w:r>
@@ -3088,6 +3560,8 @@
         <w:rPr>
           <w:b w:val="false"/>
           <w:bCs w:val="false"/>
+          <w:sz w:val="36"/>
+          <w:szCs w:val="36"/>
         </w:rPr>
         <w:t xml:space="preserve">-EVERY OTHER SCAM TEXT THREATENS YOU. THIS ONE GIVES YOU SOMETHING.</w:t>
       </w:r>
@@ -3101,6 +3575,8 @@
         <w:rPr>
           <w:b w:val="false"/>
           <w:bCs w:val="false"/>
+          <w:sz w:val="36"/>
+          <w:szCs w:val="36"/>
         </w:rPr>
         <w:t xml:space="preserve">-YOUR GUARD DROPS, BECAUSE NOBODY EXPECTS FREE MONEY TO BE THE TRAP.</w:t>
       </w:r>
@@ -3114,6 +3590,8 @@
         <w:rPr>
           <w:b w:val="false"/>
           <w:bCs w:val="false"/>
+          <w:sz w:val="36"/>
+          <w:szCs w:val="36"/>
         </w:rPr>
         <w:t xml:space="preserve">-THE LINK DOESN’T GO TO AMAZON. IT GOES TO A PAGE BUILT TO STEAL YOUR LOGIN AND YOUR CARD.</w:t>
       </w:r>
@@ -3127,6 +3605,8 @@
         <w:rPr>
           <w:b w:val="false"/>
           <w:bCs w:val="false"/>
+          <w:sz w:val="36"/>
+          <w:szCs w:val="36"/>
         </w:rPr>
         <w:t xml:space="preserve">-AND AMAZON SAYS SCAMMERS DELIBERATELY PUT THE WORD AMAZON SOMEWHERE IN THE WEB ADDRESS…</w:t>
       </w:r>
@@ -3140,6 +3620,8 @@
         <w:rPr>
           <w:b w:val="false"/>
           <w:bCs w:val="false"/>
+          <w:sz w:val="36"/>
+          <w:szCs w:val="36"/>
         </w:rPr>
         <w:t xml:space="preserve">-SO IT LOOKS RIGHT WHEN YOU GLANCE AT IT ON A PHONE.</w:t>
       </w:r>
@@ -3153,6 +3635,8 @@
         <w:rPr>
           <w:b w:val="false"/>
           <w:bCs w:val="false"/>
+          <w:sz w:val="36"/>
+          <w:szCs w:val="36"/>
         </w:rPr>
         <w:t xml:space="preserve">-HERE YOU CAN SEE ONE OF THESE TEXTS LAND.</w:t>
       </w:r>
@@ -3167,6 +3651,8 @@
           <w:b/>
           <w:bCs/>
           <w:color w:val="1155CC"/>
+          <w:sz w:val="36"/>
+          <w:szCs w:val="36"/>
         </w:rPr>
         <w:t xml:space="preserve">▶ CLIP — evidence  /  VERTICAL</w:t>
       </w:r>
@@ -3178,13 +3664,17 @@
       <w:r>
         <w:rPr>
           <w:color w:val="1155CC"/>
+          <w:sz w:val="36"/>
+          <w:szCs w:val="36"/>
         </w:rPr>
         <w:t xml:space="preserve">Source: Ryan Mack (creator_short, youtube)  —  </w:t>
       </w:r>
-      <w:hyperlink w:history="1" r:id="rId9rc5h-axpzjslsxuq-dr4">
+      <w:hyperlink w:history="1" r:id="rIdosljenn5uozd0mjhbz64m">
         <w:r>
           <w:rPr>
             <w:color w:val="1155CC"/>
+            <w:sz w:val="36"/>
+            <w:szCs w:val="36"/>
             <w:u w:val="single"/>
           </w:rPr>
           <w:t xml:space="preserve">https://www.youtube.com/watch?v=LPF9ETVTrSw</w:t>
@@ -3200,6 +3690,8 @@
           <w:b/>
           <w:bCs/>
           <w:color w:val="1155CC"/>
+          <w:sz w:val="36"/>
+          <w:szCs w:val="36"/>
         </w:rPr>
         <w:t xml:space="preserve">IN 0:00  OUT 0:52  outcue: “Stay sharp”</w:t>
       </w:r>
@@ -3213,6 +3705,8 @@
           <w:i/>
           <w:iCs/>
           <w:color w:val="1155CC"/>
+          <w:sz w:val="36"/>
+          <w:szCs w:val="36"/>
         </w:rPr>
         <w:t xml:space="preserve">“Amazon Refund Text SCAM: Don't Click That Link!”</w:t>
       </w:r>
@@ -3226,6 +3720,8 @@
           <w:i/>
           <w:iCs/>
           <w:color w:val="1155CC"/>
+          <w:sz w:val="36"/>
+          <w:szCs w:val="36"/>
         </w:rPr>
         <w:t xml:space="preserve">note: creator explainer over the text, not a pure raw screen-record; strongest available vertical evidence</w:t>
       </w:r>
@@ -3239,6 +3735,8 @@
         <w:rPr>
           <w:b w:val="false"/>
           <w:bCs w:val="false"/>
+          <w:sz w:val="36"/>
+          <w:szCs w:val="36"/>
         </w:rPr>
         <w:t xml:space="preserve">-THE SAME THING IS HAPPENING WITH THE PRIME SETTLEMENT MONEY.</w:t>
       </w:r>
@@ -3252,6 +3750,8 @@
         <w:rPr>
           <w:b w:val="false"/>
           <w:bCs w:val="false"/>
+          <w:sz w:val="36"/>
+          <w:szCs w:val="36"/>
         </w:rPr>
         <w:t xml:space="preserve">-REAL PAYMENTS ARE GOING OUT BY PAYPAL, VENMO AND CHECK BETWEEN NOW AND SEPTEMBER…</w:t>
       </w:r>
@@ -3265,6 +3765,8 @@
         <w:rPr>
           <w:b w:val="false"/>
           <w:bCs w:val="false"/>
+          <w:sz w:val="36"/>
+          <w:szCs w:val="36"/>
         </w:rPr>
         <w:t xml:space="preserve">-WHICH MEANS A FAKE PAYPAL EMAIL ABOUT AN F-T-C SETTLEMENT LANDS AT EXACTLY THE RIGHT MOMENT.</w:t>
       </w:r>
@@ -3278,6 +3780,8 @@
         <w:rPr>
           <w:b w:val="false"/>
           <w:bCs w:val="false"/>
+          <w:sz w:val="36"/>
+          <w:szCs w:val="36"/>
         </w:rPr>
         <w:t xml:space="preserve">-THE F-T-C IS BLUNT ABOUT IT. THE F-T-C IS NOT CONTACTING PEOPLE ABOUT AMAZON REFUNDS.</w:t>
       </w:r>
@@ -3291,6 +3795,8 @@
         <w:rPr>
           <w:b w:val="false"/>
           <w:bCs w:val="false"/>
+          <w:sz w:val="36"/>
+          <w:szCs w:val="36"/>
         </w:rPr>
         <w:t xml:space="preserve">-IF SOMEONE CALLS SAYING THEY’RE FROM THE F-T-C ABOUT YOUR AMAZON MONEY… IT IS A SCAM.</w:t>
       </w:r>
@@ -3304,6 +3810,8 @@
         <w:rPr>
           <w:b w:val="false"/>
           <w:bCs w:val="false"/>
+          <w:sz w:val="36"/>
+          <w:szCs w:val="36"/>
         </w:rPr>
         <w:t xml:space="preserve">-AND ONLY A SCAMMER PROMISES YOU SPECIAL ACCESS OR A GUARANTEED PAYOUT.</w:t>
       </w:r>
@@ -3317,6 +3825,8 @@
         <w:rPr>
           <w:b w:val="false"/>
           <w:bCs w:val="false"/>
+          <w:sz w:val="36"/>
+          <w:szCs w:val="36"/>
         </w:rPr>
         <w:t xml:space="preserve">-HERE’S WHAT WE KNOW RIGHT NOW.</w:t>
       </w:r>
@@ -3331,6 +3841,8 @@
           <w:b/>
           <w:bCs/>
           <w:color w:val="1155CC"/>
+          <w:sz w:val="36"/>
+          <w:szCs w:val="36"/>
         </w:rPr>
         <w:t xml:space="preserve">▶ CLIP — authority_report  /  HORIZONTAL</w:t>
       </w:r>
@@ -3342,13 +3854,17 @@
       <w:r>
         <w:rPr>
           <w:color w:val="1155CC"/>
+          <w:sz w:val="36"/>
+          <w:szCs w:val="36"/>
         </w:rPr>
         <w:t xml:space="preserve">Source: News 19 WLTX (affiliate, youtube)  —  </w:t>
       </w:r>
-      <w:hyperlink w:history="1" r:id="rIdiotlalmell7kcm75f0nyi">
+      <w:hyperlink w:history="1" r:id="rIdizxo-yba9jh3ogmo5mvg6">
         <w:r>
           <w:rPr>
             <w:color w:val="1155CC"/>
+            <w:sz w:val="36"/>
+            <w:szCs w:val="36"/>
             <w:u w:val="single"/>
           </w:rPr>
           <w:t xml:space="preserve">https://www.youtube.com/watch?v=WZYjk1fX5hs</w:t>
@@ -3364,6 +3880,8 @@
           <w:b/>
           <w:bCs/>
           <w:color w:val="1155CC"/>
+          <w:sz w:val="36"/>
+          <w:szCs w:val="36"/>
         </w:rPr>
         <w:t xml:space="preserve">IN 0:04  OUT 1:37  outcue: “just a few dollars”</w:t>
       </w:r>
@@ -3377,6 +3895,8 @@
           <w:i/>
           <w:iCs/>
           <w:color w:val="1155CC"/>
+          <w:sz w:val="36"/>
+          <w:szCs w:val="36"/>
         </w:rPr>
         <w:t xml:space="preserve">“How to spot a class action settlement email scam”</w:t>
       </w:r>
@@ -3395,6 +3915,8 @@
         <w:rPr>
           <w:b/>
           <w:bCs/>
+          <w:sz w:val="36"/>
+          <w:szCs w:val="36"/>
         </w:rPr>
         <w:t xml:space="preserve">HERE’S HOW TO PROTECT YOURSELF</w:t>
       </w:r>
@@ -3408,6 +3930,8 @@
         <w:rPr>
           <w:b w:val="false"/>
           <w:bCs w:val="false"/>
+          <w:sz w:val="36"/>
+          <w:szCs w:val="36"/>
         </w:rPr>
         <w:t xml:space="preserve">-NEVER CLICK A LINK IN A TEXT ABOUT A REFUND OR A RECALL.</w:t>
       </w:r>
@@ -3421,6 +3945,8 @@
         <w:rPr>
           <w:b w:val="false"/>
           <w:bCs w:val="false"/>
+          <w:sz w:val="36"/>
+          <w:szCs w:val="36"/>
         </w:rPr>
         <w:t xml:space="preserve">-NOT ONCE. NOT EVER.</w:t>
       </w:r>
@@ -3434,6 +3960,8 @@
         <w:rPr>
           <w:b w:val="false"/>
           <w:bCs w:val="false"/>
+          <w:sz w:val="36"/>
+          <w:szCs w:val="36"/>
         </w:rPr>
         <w:t xml:space="preserve">-OPEN THE AMAZON APP YOURSELF, OR TYPE AMAZON.COM IN BY HAND.</w:t>
       </w:r>
@@ -3447,6 +3975,8 @@
         <w:rPr>
           <w:b w:val="false"/>
           <w:bCs w:val="false"/>
+          <w:sz w:val="36"/>
+          <w:szCs w:val="36"/>
         </w:rPr>
         <w:t xml:space="preserve">-A REAL RECALL SHOWS UP IN YOUR RECALLS AND PRODUCT SAFETY ALERTS INSIDE YOUR ACCOUNT.</w:t>
       </w:r>
@@ -3460,6 +3990,8 @@
         <w:rPr>
           <w:b w:val="false"/>
           <w:bCs w:val="false"/>
+          <w:sz w:val="36"/>
+          <w:szCs w:val="36"/>
         </w:rPr>
         <w:t xml:space="preserve">-IF IT’S NOT ON THAT PAGE, THE TEXT IS LYING TO YOU.</w:t>
       </w:r>
@@ -3473,6 +4005,8 @@
         <w:rPr>
           <w:b w:val="false"/>
           <w:bCs w:val="false"/>
+          <w:sz w:val="36"/>
+          <w:szCs w:val="36"/>
         </w:rPr>
         <w:t xml:space="preserve">-NEVER USE A PHONE NUMBER PRINTED IN THE MESSAGE. LOOK IT UP YOURSELF.</w:t>
       </w:r>
@@ -3486,6 +4020,8 @@
         <w:rPr>
           <w:b w:val="false"/>
           <w:bCs w:val="false"/>
+          <w:sz w:val="36"/>
+          <w:szCs w:val="36"/>
         </w:rPr>
         <w:t xml:space="preserve">-IF YOU ALREADY CLICKED AND TYPED YOUR PASSWORD, CHANGE IT RIGHT NOW…</w:t>
       </w:r>
@@ -3499,6 +4035,8 @@
         <w:rPr>
           <w:b w:val="false"/>
           <w:bCs w:val="false"/>
+          <w:sz w:val="36"/>
+          <w:szCs w:val="36"/>
         </w:rPr>
         <w:t xml:space="preserve">-AND CHANGE IT ANYWHERE ELSE YOU USED THAT SAME PASSWORD, STARTING WITH YOUR EMAIL.</w:t>
       </w:r>
@@ -3512,6 +4050,8 @@
         <w:rPr>
           <w:b w:val="false"/>
           <w:bCs w:val="false"/>
+          <w:sz w:val="36"/>
+          <w:szCs w:val="36"/>
         </w:rPr>
         <w:t xml:space="preserve">-TURN ON TWO-STEP VERIFICATION ON YOUR AMAZON ACCOUNT TODAY.</w:t>
       </w:r>
@@ -3525,6 +4065,8 @@
         <w:rPr>
           <w:b w:val="false"/>
           <w:bCs w:val="false"/>
+          <w:sz w:val="36"/>
+          <w:szCs w:val="36"/>
         </w:rPr>
         <w:t xml:space="preserve">-IF YOU GAVE UP CARD INFORMATION, CALL YOUR BANK AND FREEZE THE CARD.</w:t>
       </w:r>
@@ -3538,6 +4080,8 @@
         <w:rPr>
           <w:b w:val="false"/>
           <w:bCs w:val="false"/>
+          <w:sz w:val="36"/>
+          <w:szCs w:val="36"/>
         </w:rPr>
         <w:t xml:space="preserve">-REPORT IT AT REPORTFRAUD.FTC.GOV — THEN DELETE THE MESSAGE.</w:t>
       </w:r>
@@ -3552,6 +4096,8 @@
         <w:rPr>
           <w:b/>
           <w:bCs/>
+          <w:sz w:val="36"/>
+          <w:szCs w:val="36"/>
         </w:rPr>
         <w:t xml:space="preserve">TAX FREE WEEKEND — DON’T PAY SALES TAX THIS WEEKEND</w:t>
       </w:r>
@@ -3565,6 +4111,8 @@
         <w:rPr>
           <w:b w:val="false"/>
           <w:bCs w:val="false"/>
+          <w:sz w:val="36"/>
+          <w:szCs w:val="36"/>
         </w:rPr>
         <w:t xml:space="preserve">-NOW THE GOOD NEWS, AND THE TIMING ON THIS IS PERFECT.</w:t>
       </w:r>
@@ -3578,6 +4126,8 @@
         <w:rPr>
           <w:b w:val="false"/>
           <w:bCs w:val="false"/>
+          <w:sz w:val="36"/>
+          <w:szCs w:val="36"/>
         </w:rPr>
         <w:t xml:space="preserve">-THIS WEEKEND, A BLOCK OF STATES TURN OFF SALES TAX ENTIRELY.</w:t>
       </w:r>
@@ -3591,6 +4141,8 @@
         <w:rPr>
           <w:b w:val="false"/>
           <w:bCs w:val="false"/>
+          <w:sz w:val="36"/>
+          <w:szCs w:val="36"/>
         </w:rPr>
         <w:t xml:space="preserve">-AUGUST 7TH THROUGH THE 9TH. SIX STATES, ZERO SALES TAX.</w:t>
       </w:r>
@@ -3604,6 +4156,8 @@
         <w:rPr>
           <w:b w:val="false"/>
           <w:bCs w:val="false"/>
+          <w:sz w:val="36"/>
+          <w:szCs w:val="36"/>
         </w:rPr>
         <w:t xml:space="preserve">-TEXAS. OHIO. MISSOURI. VIRGINIA. SOUTH CAROLINA. OKLAHOMA.</w:t>
       </w:r>
@@ -3617,6 +4171,8 @@
         <w:rPr>
           <w:b w:val="false"/>
           <w:bCs w:val="false"/>
+          <w:sz w:val="36"/>
+          <w:szCs w:val="36"/>
         </w:rPr>
         <w:t xml:space="preserve">-A FEW MORE STATES RUN IT ON DIFFERENT DATES THIS MONTH. WE’VE GOT THE FULL LIST ON SCREEN.</w:t>
       </w:r>
@@ -3630,6 +4186,8 @@
         <w:rPr>
           <w:b w:val="false"/>
           <w:bCs w:val="false"/>
+          <w:sz w:val="36"/>
+          <w:szCs w:val="36"/>
         </w:rPr>
         <w:t xml:space="preserve">-SO WHAT ACTUALLY COUNTS? CLOTHES, SHOES, BACKPACKS AND SCHOOL SUPPLIES ALMOST EVERYWHERE.</w:t>
       </w:r>
@@ -3643,6 +4201,8 @@
         <w:rPr>
           <w:b w:val="false"/>
           <w:bCs w:val="false"/>
+          <w:sz w:val="36"/>
+          <w:szCs w:val="36"/>
         </w:rPr>
         <w:t xml:space="preserve">-IN A LOT OF STATES THE MAGIC NUMBER IS UNDER $100 PER ITEM.</w:t>
       </w:r>
@@ -3656,6 +4216,8 @@
         <w:rPr>
           <w:b w:val="false"/>
           <w:bCs w:val="false"/>
+          <w:sz w:val="36"/>
+          <w:szCs w:val="36"/>
         </w:rPr>
         <w:t xml:space="preserve">-AND THAT LIMIT IS PER ITEM, NOT PER RECEIPT. THAT TRIPS EVERYBODY UP.</w:t>
       </w:r>
@@ -3669,6 +4231,8 @@
         <w:rPr>
           <w:b w:val="false"/>
           <w:bCs w:val="false"/>
+          <w:sz w:val="36"/>
+          <w:szCs w:val="36"/>
         </w:rPr>
         <w:t xml:space="preserve">-A $99 PAIR OF SNEAKERS IS TAX FREE. A $101 PAIR IS FULLY TAXED. ALL OF IT.</w:t>
       </w:r>
@@ -3682,6 +4246,8 @@
         <w:rPr>
           <w:b w:val="false"/>
           <w:bCs w:val="false"/>
+          <w:sz w:val="36"/>
+          <w:szCs w:val="36"/>
         </w:rPr>
         <w:t xml:space="preserve">-MASSACHUSETTS IS THE OUTLIER — MOST RETAIL ITEMS UP TO $2,500 QUALIFY.</w:t>
       </w:r>
@@ -3695,6 +4261,8 @@
         <w:rPr>
           <w:b w:val="false"/>
           <w:bCs w:val="false"/>
+          <w:sz w:val="36"/>
+          <w:szCs w:val="36"/>
         </w:rPr>
         <w:t xml:space="preserve">-MISSOURI AND OKLAHOMA ALSO COVER COMPUTERS. CHECK YOUR STATE’S LIST BEFORE YOU GO.</w:t>
       </w:r>
@@ -3708,6 +4276,8 @@
         <w:rPr>
           <w:b w:val="false"/>
           <w:bCs w:val="false"/>
+          <w:sz w:val="36"/>
+          <w:szCs w:val="36"/>
         </w:rPr>
         <w:t xml:space="preserve">(((CREATE FULL SCREEN GRAPHIC XXX)))</w:t>
       </w:r>
@@ -3721,6 +4291,8 @@
         <w:rPr>
           <w:b/>
           <w:bCs/>
+          <w:sz w:val="36"/>
+          <w:szCs w:val="36"/>
         </w:rPr>
         <w:t xml:space="preserve">TAX FREE DATES:</w:t>
       </w:r>
@@ -3733,6 +4305,8 @@
         <w:rPr>
           <w:b/>
           <w:bCs/>
+          <w:sz w:val="36"/>
+          <w:szCs w:val="36"/>
         </w:rPr>
         <w:t xml:space="preserve">AUG 7–9: TX, OH, MO, VA, SC, OK</w:t>
       </w:r>
@@ -3745,6 +4319,8 @@
         <w:rPr>
           <w:b/>
           <w:bCs/>
+          <w:sz w:val="36"/>
+          <w:szCs w:val="36"/>
         </w:rPr>
         <w:t xml:space="preserve">AUG 7–8: IOWA  |  AUG 8–9: MASSACHUSETTS</w:t>
       </w:r>
@@ -3757,6 +4333,8 @@
         <w:rPr>
           <w:b/>
           <w:bCs/>
+          <w:sz w:val="36"/>
+          <w:szCs w:val="36"/>
         </w:rPr>
         <w:t xml:space="preserve">AUG 7–16: ILLINOIS (RATE CUT, NOT FULL EXEMPTION)</w:t>
       </w:r>
@@ -3769,6 +4347,8 @@
         <w:rPr>
           <w:b/>
           <w:bCs/>
+          <w:sz w:val="36"/>
+          <w:szCs w:val="36"/>
         </w:rPr>
         <w:t xml:space="preserve">THROUGH AUG 20: FLORIDA</w:t>
       </w:r>
@@ -3781,6 +4361,8 @@
         <w:rPr>
           <w:b/>
           <w:bCs/>
+          <w:sz w:val="36"/>
+          <w:szCs w:val="36"/>
         </w:rPr>
         <w:t xml:space="preserve">AUG 16–22: CONNECTICUT</w:t>
       </w:r>
@@ -3794,6 +4376,8 @@
         <w:rPr>
           <w:b w:val="false"/>
           <w:bCs w:val="false"/>
+          <w:sz w:val="36"/>
+          <w:szCs w:val="36"/>
         </w:rPr>
         <w:t xml:space="preserve">-HERE’S THE MOVE MOST PEOPLE MISS.</w:t>
       </w:r>
@@ -3807,6 +4391,8 @@
         <w:rPr>
           <w:b w:val="false"/>
           <w:bCs w:val="false"/>
+          <w:sz w:val="36"/>
+          <w:szCs w:val="36"/>
         </w:rPr>
         <w:t xml:space="preserve">-YOU CAN STACK IT. THE STORE’S SALE PRICE COMES OFF FIRST, THEN TAX COMES OFF THAT.</w:t>
       </w:r>
@@ -3820,6 +4406,8 @@
         <w:rPr>
           <w:b w:val="false"/>
           <w:bCs w:val="false"/>
+          <w:sz w:val="36"/>
+          <w:szCs w:val="36"/>
         </w:rPr>
         <w:t xml:space="preserve">-SO A BACKPACK MARKED DOWN FROM $110 TO $95 DROPS UNDER THE LIMIT AND GOES TAX FREE TOO.</w:t>
       </w:r>
@@ -3833,6 +4421,8 @@
         <w:rPr>
           <w:b w:val="false"/>
           <w:bCs w:val="false"/>
+          <w:sz w:val="36"/>
+          <w:szCs w:val="36"/>
         </w:rPr>
         <w:t xml:space="preserve">-AND IN MOST STATES IT COVERS ONLINE ORDERS, AS LONG AS YOU PAY DURING THE WINDOW.</w:t>
       </w:r>
@@ -3846,6 +4436,8 @@
         <w:rPr>
           <w:b w:val="false"/>
           <w:bCs w:val="false"/>
+          <w:sz w:val="36"/>
+          <w:szCs w:val="36"/>
         </w:rPr>
         <w:t xml:space="preserve">-WATCH HIM SHOW YOU HOW MUCH THIS ACTUALLY SAVES ON A REAL SCHOOL LIST.</w:t>
       </w:r>
@@ -3860,6 +4452,8 @@
           <w:b/>
           <w:bCs/>
           <w:color w:val="1155CC"/>
+          <w:sz w:val="36"/>
+          <w:szCs w:val="36"/>
         </w:rPr>
         <w:t xml:space="preserve">▶ CLIP — explainer_demo/creator_long  /  HORIZONTAL</w:t>
       </w:r>
@@ -3871,13 +4465,17 @@
       <w:r>
         <w:rPr>
           <w:color w:val="1155CC"/>
+          <w:sz w:val="36"/>
+          <w:szCs w:val="36"/>
         </w:rPr>
         <w:t xml:space="preserve">Source: WTOL 11 (affiliate, youtube)  —  </w:t>
       </w:r>
-      <w:hyperlink w:history="1" r:id="rIdyarjuxq1x5jamsrqzlkxp">
+      <w:hyperlink w:history="1" r:id="rIditsy2lkf-dywqg7ncpwn0">
         <w:r>
           <w:rPr>
             <w:color w:val="1155CC"/>
+            <w:sz w:val="36"/>
+            <w:szCs w:val="36"/>
             <w:u w:val="single"/>
           </w:rPr>
           <w:t xml:space="preserve">https://www.youtube.com/watch?v=erKRMlCUNkc</w:t>
@@ -3893,6 +4491,8 @@
           <w:b/>
           <w:bCs/>
           <w:color w:val="1155CC"/>
+          <w:sz w:val="36"/>
+          <w:szCs w:val="36"/>
         </w:rPr>
         <w:t xml:space="preserve">IN 0:23  OUT 1:37  outcue: “cents on the dollar”</w:t>
       </w:r>
@@ -3906,6 +4506,8 @@
           <w:i/>
           <w:iCs/>
           <w:color w:val="1155CC"/>
+          <w:sz w:val="36"/>
+          <w:szCs w:val="36"/>
         </w:rPr>
         <w:t xml:space="preserve">“Ohio tax-free weekend: reporter shows savings at checkout”</w:t>
       </w:r>
@@ -3924,6 +4526,8 @@
         <w:rPr>
           <w:b/>
           <w:bCs/>
+          <w:sz w:val="36"/>
+          <w:szCs w:val="36"/>
         </w:rPr>
         <w:t xml:space="preserve">NOW THE FINE PRINT — BECAUSE THIS IS WHERE THEY GET YOU</w:t>
       </w:r>
@@ -3937,6 +4541,8 @@
         <w:rPr>
           <w:b w:val="false"/>
           <w:bCs w:val="false"/>
+          <w:sz w:val="36"/>
+          <w:szCs w:val="36"/>
         </w:rPr>
         <w:t xml:space="preserve">-NOT EVERYTHING IN THE STORE IS TAX FREE, AND THE EXCLUSIONS ARE SNEAKY.</w:t>
       </w:r>
@@ -3950,6 +4556,8 @@
         <w:rPr>
           <w:b w:val="false"/>
           <w:bCs w:val="false"/>
+          <w:sz w:val="36"/>
+          <w:szCs w:val="36"/>
         </w:rPr>
         <w:t xml:space="preserve">-A LOT OF STATES LEAVE OUT ACCESSORIES — JEWELRY, HANDBAGS, WALLETS, HAIR CLIPS.</w:t>
       </w:r>
@@ -3963,6 +4571,8 @@
         <w:rPr>
           <w:b w:val="false"/>
           <w:bCs w:val="false"/>
+          <w:sz w:val="36"/>
+          <w:szCs w:val="36"/>
         </w:rPr>
         <w:t xml:space="preserve">-PROTECTIVE AND ATHLETIC GEAR IS OFTEN EXCLUDED TOO. CLEATS AND PADS AND HELMETS.</w:t>
       </w:r>
@@ -3976,6 +4586,8 @@
         <w:rPr>
           <w:b w:val="false"/>
           <w:bCs w:val="false"/>
+          <w:sz w:val="36"/>
+          <w:szCs w:val="36"/>
         </w:rPr>
         <w:t xml:space="preserve">-SO THE SOCCER JERSEY IS TAX FREE… AND THE SHIN GUARDS ARE NOT. SAME CART.</w:t>
       </w:r>
@@ -3989,6 +4601,8 @@
         <w:rPr>
           <w:b w:val="false"/>
           <w:bCs w:val="false"/>
+          <w:sz w:val="36"/>
+          <w:szCs w:val="36"/>
         </w:rPr>
         <w:t xml:space="preserve">-RENTALS ARE USUALLY OUT. SO ARE ITEMS BOUGHT FOR A BUSINESS INSTEAD OF YOUR KID.</w:t>
       </w:r>
@@ -4002,6 +4616,8 @@
         <w:rPr>
           <w:b w:val="false"/>
           <w:bCs w:val="false"/>
+          <w:sz w:val="36"/>
+          <w:szCs w:val="36"/>
         </w:rPr>
         <w:t xml:space="preserve">-OHIO IS SMALLER THIS YEAR THAN LAST YEAR. THAT SURPRISED A LOT OF PEOPLE.</w:t>
       </w:r>
@@ -4015,6 +4631,8 @@
         <w:rPr>
           <w:b w:val="false"/>
           <w:bCs w:val="false"/>
+          <w:sz w:val="36"/>
+          <w:szCs w:val="36"/>
         </w:rPr>
         <w:t xml:space="preserve">-LAWMAKERS REPEALED THE EXPANDED VERSION, SO IT’S BACK TO THE TRADITIONAL THREE DAYS.</w:t>
       </w:r>
@@ -4028,6 +4646,8 @@
         <w:rPr>
           <w:b w:val="false"/>
           <w:bCs w:val="false"/>
+          <w:sz w:val="36"/>
+          <w:szCs w:val="36"/>
         </w:rPr>
         <w:t xml:space="preserve">-IF YOU SHOPPED OHIO LAST AUGUST EXPECTING ALMOST EVERYTHING TO QUALIFY… IT WON’T THIS TIME.</w:t>
       </w:r>
@@ -4041,6 +4661,8 @@
         <w:rPr>
           <w:b w:val="false"/>
           <w:bCs w:val="false"/>
+          <w:sz w:val="36"/>
+          <w:szCs w:val="36"/>
         </w:rPr>
         <w:t xml:space="preserve">-AND WATCH THE RAIN CHECK RULE, BECAUSE ALMOST NOBODY KNOWS IT.</w:t>
       </w:r>
@@ -4054,6 +4676,8 @@
         <w:rPr>
           <w:b w:val="false"/>
           <w:bCs w:val="false"/>
+          <w:sz w:val="36"/>
+          <w:szCs w:val="36"/>
         </w:rPr>
         <w:t xml:space="preserve">-IN ILLINOIS, A RAIN CHECK ISSUED BEFORE THE HOLIDAY STILL GETS YOU THE BREAK IF YOU BUY DURING IT.</w:t>
       </w:r>
@@ -4067,6 +4691,8 @@
         <w:rPr>
           <w:b w:val="false"/>
           <w:bCs w:val="false"/>
+          <w:sz w:val="36"/>
+          <w:szCs w:val="36"/>
         </w:rPr>
         <w:t xml:space="preserve">-BUT A RAIN CHECK ISSUED DURING THE HOLIDAY AND USED AFTER IT? YOU PAY FULL TAX.</w:t>
       </w:r>
@@ -4080,6 +4706,8 @@
         <w:rPr>
           <w:b w:val="false"/>
           <w:bCs w:val="false"/>
+          <w:sz w:val="36"/>
+          <w:szCs w:val="36"/>
         </w:rPr>
         <w:t xml:space="preserve">-ONE PIECE OF GOOD NEWS ON EXCHANGES.</w:t>
       </w:r>
@@ -4093,6 +4721,8 @@
         <w:rPr>
           <w:b w:val="false"/>
           <w:bCs w:val="false"/>
+          <w:sz w:val="36"/>
+          <w:szCs w:val="36"/>
         </w:rPr>
         <w:t xml:space="preserve">-IF YOU BUY TAX FREE AND COME BACK LATER TO SWAP FOR A DIFFERENT SIZE OR COLOR…</w:t>
       </w:r>
@@ -4106,6 +4736,8 @@
         <w:rPr>
           <w:b w:val="false"/>
           <w:bCs w:val="false"/>
+          <w:sz w:val="36"/>
+          <w:szCs w:val="36"/>
         </w:rPr>
         <w:t xml:space="preserve">-AT THE SAME PRICE OR LOWER, THEY DON’T GET TO CHARGE YOU TAX ON THE SWAP.</w:t>
       </w:r>
@@ -4119,6 +4751,8 @@
         <w:rPr>
           <w:b/>
           <w:bCs/>
+          <w:sz w:val="36"/>
+          <w:szCs w:val="36"/>
         </w:rPr>
         <w:t xml:space="preserve">HERE’S HOW TO MAKE THE MOST OF IT</w:t>
       </w:r>
@@ -4132,6 +4766,8 @@
         <w:rPr>
           <w:b w:val="false"/>
           <w:bCs w:val="false"/>
+          <w:sz w:val="36"/>
+          <w:szCs w:val="36"/>
         </w:rPr>
         <w:t xml:space="preserve">-LOOK UP YOUR OWN STATE’S OFFICIAL LIST FIRST — THE RULES ARE DIFFERENT IN EVERY STATE.</w:t>
       </w:r>
@@ -4145,6 +4781,8 @@
         <w:rPr>
           <w:b w:val="false"/>
           <w:bCs w:val="false"/>
+          <w:sz w:val="36"/>
+          <w:szCs w:val="36"/>
         </w:rPr>
         <w:t xml:space="preserve">-WATCH THE PER-ITEM PRICE LIMIT. GOING ONE DOLLAR OVER COSTS YOU THE WHOLE EXEMPTION.</w:t>
       </w:r>
@@ -4158,6 +4796,8 @@
         <w:rPr>
           <w:b w:val="false"/>
           <w:bCs w:val="false"/>
+          <w:sz w:val="36"/>
+          <w:szCs w:val="36"/>
         </w:rPr>
         <w:t xml:space="preserve">-DON’T SPLIT A PAIR OF SHOES ONTO TWO RECEIPTS.</w:t>
       </w:r>
@@ -4171,6 +4811,8 @@
         <w:rPr>
           <w:b w:val="false"/>
           <w:bCs w:val="false"/>
+          <w:sz w:val="36"/>
+          <w:szCs w:val="36"/>
         </w:rPr>
         <w:t xml:space="preserve">-IT DOESN’T WORK.</w:t>
       </w:r>
@@ -4184,6 +4826,8 @@
         <w:rPr>
           <w:b w:val="false"/>
           <w:bCs w:val="false"/>
+          <w:sz w:val="36"/>
+          <w:szCs w:val="36"/>
         </w:rPr>
         <w:t xml:space="preserve">-STACK IT ON A CLEARANCE PRICE OR A COUPON — THE MARKDOWN COMES OFF BEFORE THE TAX BREAK.</w:t>
       </w:r>
@@ -4197,6 +4841,8 @@
         <w:rPr>
           <w:b w:val="false"/>
           <w:bCs w:val="false"/>
+          <w:sz w:val="36"/>
+          <w:szCs w:val="36"/>
         </w:rPr>
         <w:t xml:space="preserve">-SHOP ONLINE IF THE STORES ARE MOBBED, BUT MAKE SURE THE PAYMENT CLEARS INSIDE THE WINDOW.</w:t>
       </w:r>
@@ -4210,6 +4856,8 @@
         <w:rPr>
           <w:b w:val="false"/>
           <w:bCs w:val="false"/>
+          <w:sz w:val="36"/>
+          <w:szCs w:val="36"/>
         </w:rPr>
         <w:t xml:space="preserve">-AND IF YOUR STATE ISN’T ON THE LIST, DON’T BUY JUNK YOU DON’T NEED JUST TO SAVE 7%.</w:t>
       </w:r>
@@ -4224,6 +4872,8 @@
         <w:rPr>
           <w:b w:val="false"/>
           <w:bCs w:val="false"/>
+          <w:sz w:val="36"/>
+          <w:szCs w:val="36"/>
         </w:rPr>
         <w:t xml:space="preserve">-END OF SHOW</w:t>
       </w:r>

</xml_diff>